<commit_message>
docs(v6.1): update SRS/pptx/drawio with implemented Batches 1-4
- SRS: §17 Implementation Update (batch summary, new tables/endpoints,
  D-03 dbo-write decision, latest FR status) + bump cover/footer to v6.1
  + revision row 6.1
- pptx: + slide 18 "Implementation Update — Batch 1-4" + bump v6.1 (18 slides)
- drawio: + page "2d. Implemented v6.1" (batch status) (11 pages)

Co-Authored-By: Claude Opus 4.8 <noreply@anthropic.com>
</commit_message>
<xml_diff>
--- a/refs/WorldFert_SRS_v6_0.docx
+++ b/refs/WorldFert_SRS_v6_0.docx
@@ -382,7 +382,7 @@
                 <w:sz w:val="17"/>
                 <w:szCs w:val="17"/>
               </w:rPr>
-              <w:t xml:space="preserve">6.0 (Production — Implemented &amp; Verified)</w:t>
+              <w:t xml:space="preserve">6.1 (Production — Implemented &amp; Verified)</w:t>
             </w:r>
           </w:p>
         </w:tc>
@@ -1925,6 +1925,140 @@
                 <w:szCs w:val="17"/>
               </w:rPr>
               <w:t xml:space="preserve">Latest Development: เพิ่มโมดูล Voucher (dbo.WFCoupon) + CN Rebate (dbo.SOInvHD 109 — single source of truth) + ใบเสนอราคา + ตั๋วคงค้าง(Aging) + บัญชี(ออกของวันนี้) · แยกระบบรีเบท 3 รูปแบบชัดเจน (฿Rebate/Voucher/ตั๋วคุม) · Dual-DB LOCAL↔REMOTE switch (X-DB-Target) · Socket.IO realtime · schema wf 18 ตาราง + 7 views · Deploy Railway+Vercel (build v4.2.11) · migration 17 ไฟล์ clean 0 errors ทั้ง local+remote · + TruckScale Integration design (Weigh-In/Out — เชื่อม WINSpeed ↔ TruckScale MySQL ผ่าน App)</w:t>
+            </w:r>
+          </w:p>
+        </w:tc>
+      </w:tr>
+      <w:tr>
+        <w:tc>
+          <w:tcPr>
+            <w:tcW w:type="dxa" w:w="1000"/>
+            <w:tcBorders>
+              <w:top w:val="single" w:color="C9D3E0" w:sz="1"/>
+              <w:left w:val="single" w:color="C9D3E0" w:sz="1"/>
+              <w:bottom w:val="single" w:color="C9D3E0" w:sz="1"/>
+              <w:right w:val="single" w:color="C9D3E0" w:sz="1"/>
+            </w:tcBorders>
+            <w:shd w:fill="EBF0F7" w:color="auto" w:val="clear"/>
+            <w:tcMar>
+              <w:top w:type="dxa" w:w="60"/>
+              <w:left w:type="dxa" w:w="110"/>
+              <w:bottom w:type="dxa" w:w="60"/>
+              <w:right w:type="dxa" w:w="110"/>
+            </w:tcMar>
+            <w:vAlign w:val="center"/>
+          </w:tcPr>
+          <w:p>
+            <w:pPr>
+              <w:spacing w:line="252"/>
+            </w:pPr>
+            <w:r>
+              <w:rPr>
+                <w:rFonts w:ascii="Prompt" w:cs="Prompt" w:eastAsia="Prompt" w:hAnsi="Prompt"/>
+                <w:color w:val="1A1A1A"/>
+                <w:sz w:val="17"/>
+                <w:szCs w:val="17"/>
+              </w:rPr>
+              <w:t xml:space="preserve">6.1</w:t>
+            </w:r>
+          </w:p>
+        </w:tc>
+        <w:tc>
+          <w:tcPr>
+            <w:tcW w:type="dxa" w:w="1400"/>
+            <w:tcBorders>
+              <w:top w:val="single" w:color="C9D3E0" w:sz="1"/>
+              <w:left w:val="single" w:color="C9D3E0" w:sz="1"/>
+              <w:bottom w:val="single" w:color="C9D3E0" w:sz="1"/>
+              <w:right w:val="single" w:color="C9D3E0" w:sz="1"/>
+            </w:tcBorders>
+            <w:shd w:fill="EBF0F7" w:color="auto" w:val="clear"/>
+            <w:tcMar>
+              <w:top w:type="dxa" w:w="60"/>
+              <w:left w:type="dxa" w:w="110"/>
+              <w:bottom w:type="dxa" w:w="60"/>
+              <w:right w:type="dxa" w:w="110"/>
+            </w:tcMar>
+            <w:vAlign w:val="center"/>
+          </w:tcPr>
+          <w:p>
+            <w:pPr>
+              <w:spacing w:line="252"/>
+            </w:pPr>
+            <w:r>
+              <w:rPr>
+                <w:rFonts w:ascii="Prompt" w:cs="Prompt" w:eastAsia="Prompt" w:hAnsi="Prompt"/>
+                <w:color w:val="1A1A1A"/>
+                <w:sz w:val="17"/>
+                <w:szCs w:val="17"/>
+              </w:rPr>
+              <w:t xml:space="preserve">27/06/2569</w:t>
+            </w:r>
+          </w:p>
+        </w:tc>
+        <w:tc>
+          <w:tcPr>
+            <w:tcW w:type="dxa" w:w="1700"/>
+            <w:tcBorders>
+              <w:top w:val="single" w:color="C9D3E0" w:sz="1"/>
+              <w:left w:val="single" w:color="C9D3E0" w:sz="1"/>
+              <w:bottom w:val="single" w:color="C9D3E0" w:sz="1"/>
+              <w:right w:val="single" w:color="C9D3E0" w:sz="1"/>
+            </w:tcBorders>
+            <w:shd w:fill="EBF0F7" w:color="auto" w:val="clear"/>
+            <w:tcMar>
+              <w:top w:type="dxa" w:w="60"/>
+              <w:left w:type="dxa" w:w="110"/>
+              <w:bottom w:type="dxa" w:w="60"/>
+              <w:right w:type="dxa" w:w="110"/>
+            </w:tcMar>
+            <w:vAlign w:val="center"/>
+          </w:tcPr>
+          <w:p>
+            <w:pPr>
+              <w:spacing w:line="252"/>
+            </w:pPr>
+            <w:r>
+              <w:rPr>
+                <w:rFonts w:ascii="Prompt" w:cs="Prompt" w:eastAsia="Prompt" w:hAnsi="Prompt"/>
+                <w:color w:val="1A1A1A"/>
+                <w:sz w:val="17"/>
+                <w:szCs w:val="17"/>
+              </w:rPr>
+              <w:t xml:space="preserve">T. Meeriksom</w:t>
+            </w:r>
+          </w:p>
+        </w:tc>
+        <w:tc>
+          <w:tcPr>
+            <w:tcW w:type="dxa" w:w="5260"/>
+            <w:tcBorders>
+              <w:top w:val="single" w:color="C9D3E0" w:sz="1"/>
+              <w:left w:val="single" w:color="C9D3E0" w:sz="1"/>
+              <w:bottom w:val="single" w:color="C9D3E0" w:sz="1"/>
+              <w:right w:val="single" w:color="C9D3E0" w:sz="1"/>
+            </w:tcBorders>
+            <w:shd w:fill="EBF0F7" w:color="auto" w:val="clear"/>
+            <w:tcMar>
+              <w:top w:type="dxa" w:w="60"/>
+              <w:left w:type="dxa" w:w="110"/>
+              <w:bottom w:type="dxa" w:w="60"/>
+              <w:right w:type="dxa" w:w="110"/>
+            </w:tcMar>
+            <w:vAlign w:val="center"/>
+          </w:tcPr>
+          <w:p>
+            <w:pPr>
+              <w:spacing w:line="252"/>
+            </w:pPr>
+            <w:r>
+              <w:rPr>
+                <w:rFonts w:ascii="Prompt" w:cs="Prompt" w:eastAsia="Prompt" w:hAnsi="Prompt"/>
+                <w:color w:val="1A1A1A"/>
+                <w:sz w:val="17"/>
+                <w:szCs w:val="17"/>
+              </w:rPr>
+              <w:t xml:space="preserve">Implementation update (build v4.2.16): implement ฟีเจอร์ที่ออกแบบไว้จนครบ — Paper Trail 4 สี+QR+scan · Rebate Plan+allocation · Verification Gate · Unlock Request · WeighTicket (gross/tare/net) · Control Ticket page · Reports+Excel · ยืนยันแนวทาง dbo write ตรง (ดู §17.3)</w:t>
             </w:r>
           </w:p>
         </w:tc>
@@ -49218,6 +49352,3079 @@
       </w:r>
     </w:p>
     <w:p>
+      <w:r>
+        <w:br w:type="page"/>
+      </w:r>
+    </w:p>
+    <w:p>
+      <w:pPr>
+        <w:pStyle w:val="Heading1"/>
+        <w:spacing w:after="160" w:before="320"/>
+      </w:pPr>
+      <w:r>
+        <w:rPr>
+          <w:rFonts w:ascii="Prompt" w:cs="Prompt" w:eastAsia="Prompt" w:hAnsi="Prompt"/>
+          <w:b/>
+          <w:bCs/>
+          <w:color w:val="1F3864"/>
+          <w:sz w:val="30"/>
+          <w:szCs w:val="30"/>
+        </w:rPr>
+        <w:t xml:space="preserve">17. อัปเดตการพัฒนา — Batch 1-4 (Implemented · build v4.2.16)</w:t>
+      </w:r>
+    </w:p>
+    <w:p>
+      <w:pPr>
+        <w:spacing w:after="80" w:line="276"/>
+      </w:pPr>
+      <w:r>
+        <w:rPr>
+          <w:rFonts w:ascii="Prompt" w:cs="Prompt" w:eastAsia="Prompt" w:hAnsi="Prompt"/>
+          <w:color w:val="1A1A1A"/>
+          <w:sz w:val="18"/>
+          <w:szCs w:val="18"/>
+        </w:rPr>
+        <w:t xml:space="preserve">หลัง v6.0 ได้ทำการ implement ฟีเจอร์ที่ออกแบบไว้แต่ยังไม่ได้สร้าง จนครบ (gap analysis) — deploy จริงบน Railway + Vercel และรัน migration clean ทั้ง local + remote · คงเหลือเฉพาะ TruckScale live ที่รอเปิด VPN (ดู §16)</w:t>
+      </w:r>
+    </w:p>
+    <w:p>
+      <w:pPr>
+        <w:pStyle w:val="Heading2"/>
+        <w:spacing w:after="120" w:before="240"/>
+      </w:pPr>
+      <w:r>
+        <w:rPr>
+          <w:rFonts w:ascii="Prompt" w:cs="Prompt" w:eastAsia="Prompt" w:hAnsi="Prompt"/>
+          <w:b/>
+          <w:bCs/>
+          <w:color w:val="1F3864"/>
+          <w:sz w:val="24"/>
+          <w:szCs w:val="24"/>
+        </w:rPr>
+        <w:t xml:space="preserve">17.1 สรุป Batch ที่ implement</w:t>
+      </w:r>
+    </w:p>
+    <w:tbl>
+      <w:tblPr>
+        <w:tblW w:type="dxa" w:w="9360"/>
+        <w:tblBorders>
+          <w:top w:val="single" w:color="auto" w:sz="4"/>
+          <w:left w:val="single" w:color="auto" w:sz="4"/>
+          <w:bottom w:val="single" w:color="auto" w:sz="4"/>
+          <w:right w:val="single" w:color="auto" w:sz="4"/>
+          <w:insideH w:val="single" w:color="auto" w:sz="4"/>
+          <w:insideV w:val="single" w:color="auto" w:sz="4"/>
+        </w:tblBorders>
+      </w:tblPr>
+      <w:tblGrid>
+        <w:gridCol w:w="700"/>
+        <w:gridCol w:w="4760"/>
+        <w:gridCol w:w="1700"/>
+        <w:gridCol w:w="2200"/>
+      </w:tblGrid>
+      <w:tr>
+        <w:trPr>
+          <w:tblHeader/>
+        </w:trPr>
+        <w:tc>
+          <w:tcPr>
+            <w:tcW w:type="dxa" w:w="700"/>
+            <w:tcBorders>
+              <w:top w:val="single" w:color="1F3864" w:sz="1"/>
+              <w:left w:val="single" w:color="1F3864" w:sz="1"/>
+              <w:bottom w:val="single" w:color="1F3864" w:sz="1"/>
+              <w:right w:val="single" w:color="1F3864" w:sz="1"/>
+            </w:tcBorders>
+            <w:shd w:fill="1F3864" w:color="auto" w:val="clear"/>
+            <w:tcMar>
+              <w:top w:type="dxa" w:w="60"/>
+              <w:left w:type="dxa" w:w="110"/>
+              <w:bottom w:type="dxa" w:w="60"/>
+              <w:right w:type="dxa" w:w="110"/>
+            </w:tcMar>
+            <w:vAlign w:val="center"/>
+          </w:tcPr>
+          <w:p>
+            <w:pPr>
+              <w:spacing w:line="252"/>
+            </w:pPr>
+            <w:r>
+              <w:rPr>
+                <w:rFonts w:ascii="Prompt" w:cs="Prompt" w:eastAsia="Prompt" w:hAnsi="Prompt"/>
+                <w:b/>
+                <w:bCs/>
+                <w:color w:val="FFFFFF"/>
+                <w:sz w:val="18"/>
+                <w:szCs w:val="18"/>
+              </w:rPr>
+              <w:t xml:space="preserve">Batch</w:t>
+            </w:r>
+          </w:p>
+        </w:tc>
+        <w:tc>
+          <w:tcPr>
+            <w:tcW w:type="dxa" w:w="4760"/>
+            <w:tcBorders>
+              <w:top w:val="single" w:color="1F3864" w:sz="1"/>
+              <w:left w:val="single" w:color="1F3864" w:sz="1"/>
+              <w:bottom w:val="single" w:color="1F3864" w:sz="1"/>
+              <w:right w:val="single" w:color="1F3864" w:sz="1"/>
+            </w:tcBorders>
+            <w:shd w:fill="1F3864" w:color="auto" w:val="clear"/>
+            <w:tcMar>
+              <w:top w:type="dxa" w:w="60"/>
+              <w:left w:type="dxa" w:w="110"/>
+              <w:bottom w:type="dxa" w:w="60"/>
+              <w:right w:type="dxa" w:w="110"/>
+            </w:tcMar>
+            <w:vAlign w:val="center"/>
+          </w:tcPr>
+          <w:p>
+            <w:pPr>
+              <w:spacing w:line="252"/>
+            </w:pPr>
+            <w:r>
+              <w:rPr>
+                <w:rFonts w:ascii="Prompt" w:cs="Prompt" w:eastAsia="Prompt" w:hAnsi="Prompt"/>
+                <w:b/>
+                <w:bCs/>
+                <w:color w:val="FFFFFF"/>
+                <w:sz w:val="18"/>
+                <w:szCs w:val="18"/>
+              </w:rPr>
+              <w:t xml:space="preserve">โมดูล</w:t>
+            </w:r>
+          </w:p>
+        </w:tc>
+        <w:tc>
+          <w:tcPr>
+            <w:tcW w:type="dxa" w:w="1700"/>
+            <w:tcBorders>
+              <w:top w:val="single" w:color="1F3864" w:sz="1"/>
+              <w:left w:val="single" w:color="1F3864" w:sz="1"/>
+              <w:bottom w:val="single" w:color="1F3864" w:sz="1"/>
+              <w:right w:val="single" w:color="1F3864" w:sz="1"/>
+            </w:tcBorders>
+            <w:shd w:fill="1F3864" w:color="auto" w:val="clear"/>
+            <w:tcMar>
+              <w:top w:type="dxa" w:w="60"/>
+              <w:left w:type="dxa" w:w="110"/>
+              <w:bottom w:type="dxa" w:w="60"/>
+              <w:right w:type="dxa" w:w="110"/>
+            </w:tcMar>
+            <w:vAlign w:val="center"/>
+          </w:tcPr>
+          <w:p>
+            <w:pPr>
+              <w:spacing w:line="252"/>
+            </w:pPr>
+            <w:r>
+              <w:rPr>
+                <w:rFonts w:ascii="Prompt" w:cs="Prompt" w:eastAsia="Prompt" w:hAnsi="Prompt"/>
+                <w:b/>
+                <w:bCs/>
+                <w:color w:val="FFFFFF"/>
+                <w:sz w:val="18"/>
+                <w:szCs w:val="18"/>
+              </w:rPr>
+              <w:t xml:space="preserve">FR</w:t>
+            </w:r>
+          </w:p>
+        </w:tc>
+        <w:tc>
+          <w:tcPr>
+            <w:tcW w:type="dxa" w:w="2200"/>
+            <w:tcBorders>
+              <w:top w:val="single" w:color="1F3864" w:sz="1"/>
+              <w:left w:val="single" w:color="1F3864" w:sz="1"/>
+              <w:bottom w:val="single" w:color="1F3864" w:sz="1"/>
+              <w:right w:val="single" w:color="1F3864" w:sz="1"/>
+            </w:tcBorders>
+            <w:shd w:fill="1F3864" w:color="auto" w:val="clear"/>
+            <w:tcMar>
+              <w:top w:type="dxa" w:w="60"/>
+              <w:left w:type="dxa" w:w="110"/>
+              <w:bottom w:type="dxa" w:w="60"/>
+              <w:right w:type="dxa" w:w="110"/>
+            </w:tcMar>
+            <w:vAlign w:val="center"/>
+          </w:tcPr>
+          <w:p>
+            <w:pPr>
+              <w:spacing w:line="252"/>
+            </w:pPr>
+            <w:r>
+              <w:rPr>
+                <w:rFonts w:ascii="Prompt" w:cs="Prompt" w:eastAsia="Prompt" w:hAnsi="Prompt"/>
+                <w:b/>
+                <w:bCs/>
+                <w:color w:val="FFFFFF"/>
+                <w:sz w:val="18"/>
+                <w:szCs w:val="18"/>
+              </w:rPr>
+              <w:t xml:space="preserve">สถานะ</w:t>
+            </w:r>
+          </w:p>
+        </w:tc>
+      </w:tr>
+      <w:tr>
+        <w:tc>
+          <w:tcPr>
+            <w:tcW w:type="dxa" w:w="700"/>
+            <w:tcBorders>
+              <w:top w:val="single" w:color="C9D3E0" w:sz="1"/>
+              <w:left w:val="single" w:color="C9D3E0" w:sz="1"/>
+              <w:bottom w:val="single" w:color="C9D3E0" w:sz="1"/>
+              <w:right w:val="single" w:color="C9D3E0" w:sz="1"/>
+            </w:tcBorders>
+            <w:shd w:fill="FFFFFF" w:color="auto" w:val="clear"/>
+            <w:tcMar>
+              <w:top w:type="dxa" w:w="60"/>
+              <w:left w:type="dxa" w:w="110"/>
+              <w:bottom w:type="dxa" w:w="60"/>
+              <w:right w:type="dxa" w:w="110"/>
+            </w:tcMar>
+            <w:vAlign w:val="center"/>
+          </w:tcPr>
+          <w:p>
+            <w:pPr>
+              <w:spacing w:line="252"/>
+            </w:pPr>
+            <w:r>
+              <w:rPr>
+                <w:rFonts w:ascii="Prompt" w:cs="Prompt" w:eastAsia="Prompt" w:hAnsi="Prompt"/>
+                <w:color w:val="1A1A1A"/>
+                <w:sz w:val="17"/>
+                <w:szCs w:val="17"/>
+              </w:rPr>
+              <w:t xml:space="preserve">1</w:t>
+            </w:r>
+          </w:p>
+        </w:tc>
+        <w:tc>
+          <w:tcPr>
+            <w:tcW w:type="dxa" w:w="4760"/>
+            <w:tcBorders>
+              <w:top w:val="single" w:color="C9D3E0" w:sz="1"/>
+              <w:left w:val="single" w:color="C9D3E0" w:sz="1"/>
+              <w:bottom w:val="single" w:color="C9D3E0" w:sz="1"/>
+              <w:right w:val="single" w:color="C9D3E0" w:sz="1"/>
+            </w:tcBorders>
+            <w:shd w:fill="FFFFFF" w:color="auto" w:val="clear"/>
+            <w:tcMar>
+              <w:top w:type="dxa" w:w="60"/>
+              <w:left w:type="dxa" w:w="110"/>
+              <w:bottom w:type="dxa" w:w="60"/>
+              <w:right w:type="dxa" w:w="110"/>
+            </w:tcMar>
+            <w:vAlign w:val="center"/>
+          </w:tcPr>
+          <w:p>
+            <w:pPr>
+              <w:spacing w:line="252"/>
+            </w:pPr>
+            <w:r>
+              <w:rPr>
+                <w:rFonts w:ascii="Prompt" w:cs="Prompt" w:eastAsia="Prompt" w:hAnsi="Prompt"/>
+                <w:color w:val="1A1A1A"/>
+                <w:sz w:val="17"/>
+                <w:szCs w:val="17"/>
+              </w:rPr>
+              <w:t xml:space="preserve">Paper Trail — เอกสาร 4 สี + QR + scan tracking + alert ใบหาย</w:t>
+            </w:r>
+          </w:p>
+        </w:tc>
+        <w:tc>
+          <w:tcPr>
+            <w:tcW w:type="dxa" w:w="1700"/>
+            <w:tcBorders>
+              <w:top w:val="single" w:color="C9D3E0" w:sz="1"/>
+              <w:left w:val="single" w:color="C9D3E0" w:sz="1"/>
+              <w:bottom w:val="single" w:color="C9D3E0" w:sz="1"/>
+              <w:right w:val="single" w:color="C9D3E0" w:sz="1"/>
+            </w:tcBorders>
+            <w:shd w:fill="FFFFFF" w:color="auto" w:val="clear"/>
+            <w:tcMar>
+              <w:top w:type="dxa" w:w="60"/>
+              <w:left w:type="dxa" w:w="110"/>
+              <w:bottom w:type="dxa" w:w="60"/>
+              <w:right w:type="dxa" w:w="110"/>
+            </w:tcMar>
+            <w:vAlign w:val="center"/>
+          </w:tcPr>
+          <w:p>
+            <w:pPr>
+              <w:spacing w:line="252"/>
+            </w:pPr>
+            <w:r>
+              <w:rPr>
+                <w:rFonts w:ascii="Prompt" w:cs="Prompt" w:eastAsia="Prompt" w:hAnsi="Prompt"/>
+                <w:color w:val="1A1A1A"/>
+                <w:sz w:val="17"/>
+                <w:szCs w:val="17"/>
+              </w:rPr>
+              <w:t xml:space="preserve">FR-004/012/013</w:t>
+            </w:r>
+          </w:p>
+        </w:tc>
+        <w:tc>
+          <w:tcPr>
+            <w:tcW w:type="dxa" w:w="2200"/>
+            <w:tcBorders>
+              <w:top w:val="single" w:color="C9D3E0" w:sz="1"/>
+              <w:left w:val="single" w:color="C9D3E0" w:sz="1"/>
+              <w:bottom w:val="single" w:color="C9D3E0" w:sz="1"/>
+              <w:right w:val="single" w:color="C9D3E0" w:sz="1"/>
+            </w:tcBorders>
+            <w:shd w:fill="FFFFFF" w:color="auto" w:val="clear"/>
+            <w:tcMar>
+              <w:top w:type="dxa" w:w="60"/>
+              <w:left w:type="dxa" w:w="110"/>
+              <w:bottom w:type="dxa" w:w="60"/>
+              <w:right w:type="dxa" w:w="110"/>
+            </w:tcMar>
+            <w:vAlign w:val="center"/>
+          </w:tcPr>
+          <w:p>
+            <w:pPr>
+              <w:spacing w:line="252"/>
+            </w:pPr>
+            <w:r>
+              <w:rPr>
+                <w:rFonts w:ascii="Prompt" w:cs="Prompt" w:eastAsia="Prompt" w:hAnsi="Prompt"/>
+                <w:color w:val="1A1A1A"/>
+                <w:sz w:val="17"/>
+                <w:szCs w:val="17"/>
+              </w:rPr>
+              <w:t xml:space="preserve">✓ deploy v4.2.12</w:t>
+            </w:r>
+          </w:p>
+        </w:tc>
+      </w:tr>
+      <w:tr>
+        <w:tc>
+          <w:tcPr>
+            <w:tcW w:type="dxa" w:w="700"/>
+            <w:tcBorders>
+              <w:top w:val="single" w:color="C9D3E0" w:sz="1"/>
+              <w:left w:val="single" w:color="C9D3E0" w:sz="1"/>
+              <w:bottom w:val="single" w:color="C9D3E0" w:sz="1"/>
+              <w:right w:val="single" w:color="C9D3E0" w:sz="1"/>
+            </w:tcBorders>
+            <w:shd w:fill="FFFFFF" w:color="auto" w:val="clear"/>
+            <w:tcMar>
+              <w:top w:type="dxa" w:w="60"/>
+              <w:left w:type="dxa" w:w="110"/>
+              <w:bottom w:type="dxa" w:w="60"/>
+              <w:right w:type="dxa" w:w="110"/>
+            </w:tcMar>
+            <w:vAlign w:val="center"/>
+          </w:tcPr>
+          <w:p>
+            <w:pPr>
+              <w:spacing w:line="252"/>
+            </w:pPr>
+            <w:r>
+              <w:rPr>
+                <w:rFonts w:ascii="Prompt" w:cs="Prompt" w:eastAsia="Prompt" w:hAnsi="Prompt"/>
+                <w:color w:val="1A1A1A"/>
+                <w:sz w:val="17"/>
+                <w:szCs w:val="17"/>
+              </w:rPr>
+              <w:t xml:space="preserve">2</w:t>
+            </w:r>
+          </w:p>
+        </w:tc>
+        <w:tc>
+          <w:tcPr>
+            <w:tcW w:type="dxa" w:w="4760"/>
+            <w:tcBorders>
+              <w:top w:val="single" w:color="C9D3E0" w:sz="1"/>
+              <w:left w:val="single" w:color="C9D3E0" w:sz="1"/>
+              <w:bottom w:val="single" w:color="C9D3E0" w:sz="1"/>
+              <w:right w:val="single" w:color="C9D3E0" w:sz="1"/>
+            </w:tcBorders>
+            <w:shd w:fill="FFFFFF" w:color="auto" w:val="clear"/>
+            <w:tcMar>
+              <w:top w:type="dxa" w:w="60"/>
+              <w:left w:type="dxa" w:w="110"/>
+              <w:bottom w:type="dxa" w:w="60"/>
+              <w:right w:type="dxa" w:w="110"/>
+            </w:tcMar>
+            <w:vAlign w:val="center"/>
+          </w:tcPr>
+          <w:p>
+            <w:pPr>
+              <w:spacing w:line="252"/>
+            </w:pPr>
+            <w:r>
+              <w:rPr>
+                <w:rFonts w:ascii="Prompt" w:cs="Prompt" w:eastAsia="Prompt" w:hAnsi="Prompt"/>
+                <w:color w:val="1A1A1A"/>
+                <w:sz w:val="17"/>
+                <w:szCs w:val="17"/>
+              </w:rPr>
+              <w:t xml:space="preserve">Rebate Plan + จัดสรร Pool ตามภาค/priority (Price Book ใช้ EMSetPriceDT เดิม)</w:t>
+            </w:r>
+          </w:p>
+        </w:tc>
+        <w:tc>
+          <w:tcPr>
+            <w:tcW w:type="dxa" w:w="1700"/>
+            <w:tcBorders>
+              <w:top w:val="single" w:color="C9D3E0" w:sz="1"/>
+              <w:left w:val="single" w:color="C9D3E0" w:sz="1"/>
+              <w:bottom w:val="single" w:color="C9D3E0" w:sz="1"/>
+              <w:right w:val="single" w:color="C9D3E0" w:sz="1"/>
+            </w:tcBorders>
+            <w:shd w:fill="FFFFFF" w:color="auto" w:val="clear"/>
+            <w:tcMar>
+              <w:top w:type="dxa" w:w="60"/>
+              <w:left w:type="dxa" w:w="110"/>
+              <w:bottom w:type="dxa" w:w="60"/>
+              <w:right w:type="dxa" w:w="110"/>
+            </w:tcMar>
+            <w:vAlign w:val="center"/>
+          </w:tcPr>
+          <w:p>
+            <w:pPr>
+              <w:spacing w:line="252"/>
+            </w:pPr>
+            <w:r>
+              <w:rPr>
+                <w:rFonts w:ascii="Prompt" w:cs="Prompt" w:eastAsia="Prompt" w:hAnsi="Prompt"/>
+                <w:color w:val="1A1A1A"/>
+                <w:sz w:val="17"/>
+                <w:szCs w:val="17"/>
+              </w:rPr>
+              <w:t xml:space="preserve">FR-008/009/023</w:t>
+            </w:r>
+          </w:p>
+        </w:tc>
+        <w:tc>
+          <w:tcPr>
+            <w:tcW w:type="dxa" w:w="2200"/>
+            <w:tcBorders>
+              <w:top w:val="single" w:color="C9D3E0" w:sz="1"/>
+              <w:left w:val="single" w:color="C9D3E0" w:sz="1"/>
+              <w:bottom w:val="single" w:color="C9D3E0" w:sz="1"/>
+              <w:right w:val="single" w:color="C9D3E0" w:sz="1"/>
+            </w:tcBorders>
+            <w:shd w:fill="FFFFFF" w:color="auto" w:val="clear"/>
+            <w:tcMar>
+              <w:top w:type="dxa" w:w="60"/>
+              <w:left w:type="dxa" w:w="110"/>
+              <w:bottom w:type="dxa" w:w="60"/>
+              <w:right w:type="dxa" w:w="110"/>
+            </w:tcMar>
+            <w:vAlign w:val="center"/>
+          </w:tcPr>
+          <w:p>
+            <w:pPr>
+              <w:spacing w:line="252"/>
+            </w:pPr>
+            <w:r>
+              <w:rPr>
+                <w:rFonts w:ascii="Prompt" w:cs="Prompt" w:eastAsia="Prompt" w:hAnsi="Prompt"/>
+                <w:color w:val="1A1A1A"/>
+                <w:sz w:val="17"/>
+                <w:szCs w:val="17"/>
+              </w:rPr>
+              <w:t xml:space="preserve">✓ deploy v4.2.13</w:t>
+            </w:r>
+          </w:p>
+        </w:tc>
+      </w:tr>
+      <w:tr>
+        <w:tc>
+          <w:tcPr>
+            <w:tcW w:type="dxa" w:w="700"/>
+            <w:tcBorders>
+              <w:top w:val="single" w:color="C9D3E0" w:sz="1"/>
+              <w:left w:val="single" w:color="C9D3E0" w:sz="1"/>
+              <w:bottom w:val="single" w:color="C9D3E0" w:sz="1"/>
+              <w:right w:val="single" w:color="C9D3E0" w:sz="1"/>
+            </w:tcBorders>
+            <w:shd w:fill="FFFFFF" w:color="auto" w:val="clear"/>
+            <w:tcMar>
+              <w:top w:type="dxa" w:w="60"/>
+              <w:left w:type="dxa" w:w="110"/>
+              <w:bottom w:type="dxa" w:w="60"/>
+              <w:right w:type="dxa" w:w="110"/>
+            </w:tcMar>
+            <w:vAlign w:val="center"/>
+          </w:tcPr>
+          <w:p>
+            <w:pPr>
+              <w:spacing w:line="252"/>
+            </w:pPr>
+            <w:r>
+              <w:rPr>
+                <w:rFonts w:ascii="Prompt" w:cs="Prompt" w:eastAsia="Prompt" w:hAnsi="Prompt"/>
+                <w:color w:val="1A1A1A"/>
+                <w:sz w:val="17"/>
+                <w:szCs w:val="17"/>
+              </w:rPr>
+              <w:t xml:space="preserve">3</w:t>
+            </w:r>
+          </w:p>
+        </w:tc>
+        <w:tc>
+          <w:tcPr>
+            <w:tcW w:type="dxa" w:w="4760"/>
+            <w:tcBorders>
+              <w:top w:val="single" w:color="C9D3E0" w:sz="1"/>
+              <w:left w:val="single" w:color="C9D3E0" w:sz="1"/>
+              <w:bottom w:val="single" w:color="C9D3E0" w:sz="1"/>
+              <w:right w:val="single" w:color="C9D3E0" w:sz="1"/>
+            </w:tcBorders>
+            <w:shd w:fill="FFFFFF" w:color="auto" w:val="clear"/>
+            <w:tcMar>
+              <w:top w:type="dxa" w:w="60"/>
+              <w:left w:type="dxa" w:w="110"/>
+              <w:bottom w:type="dxa" w:w="60"/>
+              <w:right w:type="dxa" w:w="110"/>
+            </w:tcMar>
+            <w:vAlign w:val="center"/>
+          </w:tcPr>
+          <w:p>
+            <w:pPr>
+              <w:spacing w:line="252"/>
+            </w:pPr>
+            <w:r>
+              <w:rPr>
+                <w:rFonts w:ascii="Prompt" w:cs="Prompt" w:eastAsia="Prompt" w:hAnsi="Prompt"/>
+                <w:color w:val="1A1A1A"/>
+                <w:sz w:val="17"/>
+                <w:szCs w:val="17"/>
+              </w:rPr>
+              <w:t xml:space="preserve">Verification Gate (ตรวจซ้ำก่อนยืนยัน) + Unlock Request flow (สายอนุมัติ)</w:t>
+            </w:r>
+          </w:p>
+        </w:tc>
+        <w:tc>
+          <w:tcPr>
+            <w:tcW w:type="dxa" w:w="1700"/>
+            <w:tcBorders>
+              <w:top w:val="single" w:color="C9D3E0" w:sz="1"/>
+              <w:left w:val="single" w:color="C9D3E0" w:sz="1"/>
+              <w:bottom w:val="single" w:color="C9D3E0" w:sz="1"/>
+              <w:right w:val="single" w:color="C9D3E0" w:sz="1"/>
+            </w:tcBorders>
+            <w:shd w:fill="FFFFFF" w:color="auto" w:val="clear"/>
+            <w:tcMar>
+              <w:top w:type="dxa" w:w="60"/>
+              <w:left w:type="dxa" w:w="110"/>
+              <w:bottom w:type="dxa" w:w="60"/>
+              <w:right w:type="dxa" w:w="110"/>
+            </w:tcMar>
+            <w:vAlign w:val="center"/>
+          </w:tcPr>
+          <w:p>
+            <w:pPr>
+              <w:spacing w:line="252"/>
+            </w:pPr>
+            <w:r>
+              <w:rPr>
+                <w:rFonts w:ascii="Prompt" w:cs="Prompt" w:eastAsia="Prompt" w:hAnsi="Prompt"/>
+                <w:color w:val="1A1A1A"/>
+                <w:sz w:val="17"/>
+                <w:szCs w:val="17"/>
+              </w:rPr>
+              <w:t xml:space="preserve">FR-022/006/007</w:t>
+            </w:r>
+          </w:p>
+        </w:tc>
+        <w:tc>
+          <w:tcPr>
+            <w:tcW w:type="dxa" w:w="2200"/>
+            <w:tcBorders>
+              <w:top w:val="single" w:color="C9D3E0" w:sz="1"/>
+              <w:left w:val="single" w:color="C9D3E0" w:sz="1"/>
+              <w:bottom w:val="single" w:color="C9D3E0" w:sz="1"/>
+              <w:right w:val="single" w:color="C9D3E0" w:sz="1"/>
+            </w:tcBorders>
+            <w:shd w:fill="FFFFFF" w:color="auto" w:val="clear"/>
+            <w:tcMar>
+              <w:top w:type="dxa" w:w="60"/>
+              <w:left w:type="dxa" w:w="110"/>
+              <w:bottom w:type="dxa" w:w="60"/>
+              <w:right w:type="dxa" w:w="110"/>
+            </w:tcMar>
+            <w:vAlign w:val="center"/>
+          </w:tcPr>
+          <w:p>
+            <w:pPr>
+              <w:spacing w:line="252"/>
+            </w:pPr>
+            <w:r>
+              <w:rPr>
+                <w:rFonts w:ascii="Prompt" w:cs="Prompt" w:eastAsia="Prompt" w:hAnsi="Prompt"/>
+                <w:color w:val="1A1A1A"/>
+                <w:sz w:val="17"/>
+                <w:szCs w:val="17"/>
+              </w:rPr>
+              <w:t xml:space="preserve">✓ deploy v4.2.14</w:t>
+            </w:r>
+          </w:p>
+        </w:tc>
+      </w:tr>
+      <w:tr>
+        <w:tc>
+          <w:tcPr>
+            <w:tcW w:type="dxa" w:w="700"/>
+            <w:tcBorders>
+              <w:top w:val="single" w:color="C9D3E0" w:sz="1"/>
+              <w:left w:val="single" w:color="C9D3E0" w:sz="1"/>
+              <w:bottom w:val="single" w:color="C9D3E0" w:sz="1"/>
+              <w:right w:val="single" w:color="C9D3E0" w:sz="1"/>
+            </w:tcBorders>
+            <w:shd w:fill="FFFFFF" w:color="auto" w:val="clear"/>
+            <w:tcMar>
+              <w:top w:type="dxa" w:w="60"/>
+              <w:left w:type="dxa" w:w="110"/>
+              <w:bottom w:type="dxa" w:w="60"/>
+              <w:right w:type="dxa" w:w="110"/>
+            </w:tcMar>
+            <w:vAlign w:val="center"/>
+          </w:tcPr>
+          <w:p>
+            <w:pPr>
+              <w:spacing w:line="252"/>
+            </w:pPr>
+            <w:r>
+              <w:rPr>
+                <w:rFonts w:ascii="Prompt" w:cs="Prompt" w:eastAsia="Prompt" w:hAnsi="Prompt"/>
+                <w:color w:val="1A1A1A"/>
+                <w:sz w:val="17"/>
+                <w:szCs w:val="17"/>
+              </w:rPr>
+              <w:t xml:space="preserve">4a</w:t>
+            </w:r>
+          </w:p>
+        </w:tc>
+        <w:tc>
+          <w:tcPr>
+            <w:tcW w:type="dxa" w:w="4760"/>
+            <w:tcBorders>
+              <w:top w:val="single" w:color="C9D3E0" w:sz="1"/>
+              <w:left w:val="single" w:color="C9D3E0" w:sz="1"/>
+              <w:bottom w:val="single" w:color="C9D3E0" w:sz="1"/>
+              <w:right w:val="single" w:color="C9D3E0" w:sz="1"/>
+            </w:tcBorders>
+            <w:shd w:fill="FFFFFF" w:color="auto" w:val="clear"/>
+            <w:tcMar>
+              <w:top w:type="dxa" w:w="60"/>
+              <w:left w:type="dxa" w:w="110"/>
+              <w:bottom w:type="dxa" w:w="60"/>
+              <w:right w:type="dxa" w:w="110"/>
+            </w:tcMar>
+            <w:vAlign w:val="center"/>
+          </w:tcPr>
+          <w:p>
+            <w:pPr>
+              <w:spacing w:line="252"/>
+            </w:pPr>
+            <w:r>
+              <w:rPr>
+                <w:rFonts w:ascii="Prompt" w:cs="Prompt" w:eastAsia="Prompt" w:hAnsi="Prompt"/>
+                <w:color w:val="1A1A1A"/>
+                <w:sz w:val="17"/>
+                <w:szCs w:val="17"/>
+              </w:rPr>
+              <w:t xml:space="preserve">WeighTicket — gross/tare/net + เครื่องชั่ง (รากฐาน TruckScale)</w:t>
+            </w:r>
+          </w:p>
+        </w:tc>
+        <w:tc>
+          <w:tcPr>
+            <w:tcW w:type="dxa" w:w="1700"/>
+            <w:tcBorders>
+              <w:top w:val="single" w:color="C9D3E0" w:sz="1"/>
+              <w:left w:val="single" w:color="C9D3E0" w:sz="1"/>
+              <w:bottom w:val="single" w:color="C9D3E0" w:sz="1"/>
+              <w:right w:val="single" w:color="C9D3E0" w:sz="1"/>
+            </w:tcBorders>
+            <w:shd w:fill="FFFFFF" w:color="auto" w:val="clear"/>
+            <w:tcMar>
+              <w:top w:type="dxa" w:w="60"/>
+              <w:left w:type="dxa" w:w="110"/>
+              <w:bottom w:type="dxa" w:w="60"/>
+              <w:right w:type="dxa" w:w="110"/>
+            </w:tcMar>
+            <w:vAlign w:val="center"/>
+          </w:tcPr>
+          <w:p>
+            <w:pPr>
+              <w:spacing w:line="252"/>
+            </w:pPr>
+            <w:r>
+              <w:rPr>
+                <w:rFonts w:ascii="Prompt" w:cs="Prompt" w:eastAsia="Prompt" w:hAnsi="Prompt"/>
+                <w:color w:val="1A1A1A"/>
+                <w:sz w:val="17"/>
+                <w:szCs w:val="17"/>
+              </w:rPr>
+              <w:t xml:space="preserve">FR (weigh)</w:t>
+            </w:r>
+          </w:p>
+        </w:tc>
+        <w:tc>
+          <w:tcPr>
+            <w:tcW w:type="dxa" w:w="2200"/>
+            <w:tcBorders>
+              <w:top w:val="single" w:color="C9D3E0" w:sz="1"/>
+              <w:left w:val="single" w:color="C9D3E0" w:sz="1"/>
+              <w:bottom w:val="single" w:color="C9D3E0" w:sz="1"/>
+              <w:right w:val="single" w:color="C9D3E0" w:sz="1"/>
+            </w:tcBorders>
+            <w:shd w:fill="FFFFFF" w:color="auto" w:val="clear"/>
+            <w:tcMar>
+              <w:top w:type="dxa" w:w="60"/>
+              <w:left w:type="dxa" w:w="110"/>
+              <w:bottom w:type="dxa" w:w="60"/>
+              <w:right w:type="dxa" w:w="110"/>
+            </w:tcMar>
+            <w:vAlign w:val="center"/>
+          </w:tcPr>
+          <w:p>
+            <w:pPr>
+              <w:spacing w:line="252"/>
+            </w:pPr>
+            <w:r>
+              <w:rPr>
+                <w:rFonts w:ascii="Prompt" w:cs="Prompt" w:eastAsia="Prompt" w:hAnsi="Prompt"/>
+                <w:color w:val="1A1A1A"/>
+                <w:sz w:val="17"/>
+                <w:szCs w:val="17"/>
+              </w:rPr>
+              <w:t xml:space="preserve">✓ deploy v4.2.15</w:t>
+            </w:r>
+          </w:p>
+        </w:tc>
+      </w:tr>
+      <w:tr>
+        <w:tc>
+          <w:tcPr>
+            <w:tcW w:type="dxa" w:w="700"/>
+            <w:tcBorders>
+              <w:top w:val="single" w:color="C9D3E0" w:sz="1"/>
+              <w:left w:val="single" w:color="C9D3E0" w:sz="1"/>
+              <w:bottom w:val="single" w:color="C9D3E0" w:sz="1"/>
+              <w:right w:val="single" w:color="C9D3E0" w:sz="1"/>
+            </w:tcBorders>
+            <w:shd w:fill="FFFFFF" w:color="auto" w:val="clear"/>
+            <w:tcMar>
+              <w:top w:type="dxa" w:w="60"/>
+              <w:left w:type="dxa" w:w="110"/>
+              <w:bottom w:type="dxa" w:w="60"/>
+              <w:right w:type="dxa" w:w="110"/>
+            </w:tcMar>
+            <w:vAlign w:val="center"/>
+          </w:tcPr>
+          <w:p>
+            <w:pPr>
+              <w:spacing w:line="252"/>
+            </w:pPr>
+            <w:r>
+              <w:rPr>
+                <w:rFonts w:ascii="Prompt" w:cs="Prompt" w:eastAsia="Prompt" w:hAnsi="Prompt"/>
+                <w:color w:val="1A1A1A"/>
+                <w:sz w:val="17"/>
+                <w:szCs w:val="17"/>
+              </w:rPr>
+              <w:t xml:space="preserve">4b</w:t>
+            </w:r>
+          </w:p>
+        </w:tc>
+        <w:tc>
+          <w:tcPr>
+            <w:tcW w:type="dxa" w:w="4760"/>
+            <w:tcBorders>
+              <w:top w:val="single" w:color="C9D3E0" w:sz="1"/>
+              <w:left w:val="single" w:color="C9D3E0" w:sz="1"/>
+              <w:bottom w:val="single" w:color="C9D3E0" w:sz="1"/>
+              <w:right w:val="single" w:color="C9D3E0" w:sz="1"/>
+            </w:tcBorders>
+            <w:shd w:fill="FFFFFF" w:color="auto" w:val="clear"/>
+            <w:tcMar>
+              <w:top w:type="dxa" w:w="60"/>
+              <w:left w:type="dxa" w:w="110"/>
+              <w:bottom w:type="dxa" w:w="60"/>
+              <w:right w:type="dxa" w:w="110"/>
+            </w:tcMar>
+            <w:vAlign w:val="center"/>
+          </w:tcPr>
+          <w:p>
+            <w:pPr>
+              <w:spacing w:line="252"/>
+            </w:pPr>
+            <w:r>
+              <w:rPr>
+                <w:rFonts w:ascii="Prompt" w:cs="Prompt" w:eastAsia="Prompt" w:hAnsi="Prompt"/>
+                <w:color w:val="1A1A1A"/>
+                <w:sz w:val="17"/>
+                <w:szCs w:val="17"/>
+              </w:rPr>
+              <w:t xml:space="preserve">Control Ticket page (คงเหลือ+ประวัติตัด) + Reports + Export Excel</w:t>
+            </w:r>
+          </w:p>
+        </w:tc>
+        <w:tc>
+          <w:tcPr>
+            <w:tcW w:type="dxa" w:w="1700"/>
+            <w:tcBorders>
+              <w:top w:val="single" w:color="C9D3E0" w:sz="1"/>
+              <w:left w:val="single" w:color="C9D3E0" w:sz="1"/>
+              <w:bottom w:val="single" w:color="C9D3E0" w:sz="1"/>
+              <w:right w:val="single" w:color="C9D3E0" w:sz="1"/>
+            </w:tcBorders>
+            <w:shd w:fill="FFFFFF" w:color="auto" w:val="clear"/>
+            <w:tcMar>
+              <w:top w:type="dxa" w:w="60"/>
+              <w:left w:type="dxa" w:w="110"/>
+              <w:bottom w:type="dxa" w:w="60"/>
+              <w:right w:type="dxa" w:w="110"/>
+            </w:tcMar>
+            <w:vAlign w:val="center"/>
+          </w:tcPr>
+          <w:p>
+            <w:pPr>
+              <w:spacing w:line="252"/>
+            </w:pPr>
+            <w:r>
+              <w:rPr>
+                <w:rFonts w:ascii="Prompt" w:cs="Prompt" w:eastAsia="Prompt" w:hAnsi="Prompt"/>
+                <w:color w:val="1A1A1A"/>
+                <w:sz w:val="17"/>
+                <w:szCs w:val="17"/>
+              </w:rPr>
+              <w:t xml:space="preserve">FR-021/017</w:t>
+            </w:r>
+          </w:p>
+        </w:tc>
+        <w:tc>
+          <w:tcPr>
+            <w:tcW w:type="dxa" w:w="2200"/>
+            <w:tcBorders>
+              <w:top w:val="single" w:color="C9D3E0" w:sz="1"/>
+              <w:left w:val="single" w:color="C9D3E0" w:sz="1"/>
+              <w:bottom w:val="single" w:color="C9D3E0" w:sz="1"/>
+              <w:right w:val="single" w:color="C9D3E0" w:sz="1"/>
+            </w:tcBorders>
+            <w:shd w:fill="FFFFFF" w:color="auto" w:val="clear"/>
+            <w:tcMar>
+              <w:top w:type="dxa" w:w="60"/>
+              <w:left w:type="dxa" w:w="110"/>
+              <w:bottom w:type="dxa" w:w="60"/>
+              <w:right w:type="dxa" w:w="110"/>
+            </w:tcMar>
+            <w:vAlign w:val="center"/>
+          </w:tcPr>
+          <w:p>
+            <w:pPr>
+              <w:spacing w:line="252"/>
+            </w:pPr>
+            <w:r>
+              <w:rPr>
+                <w:rFonts w:ascii="Prompt" w:cs="Prompt" w:eastAsia="Prompt" w:hAnsi="Prompt"/>
+                <w:color w:val="1A1A1A"/>
+                <w:sz w:val="17"/>
+                <w:szCs w:val="17"/>
+              </w:rPr>
+              <w:t xml:space="preserve">✓ deploy v4.2.16</w:t>
+            </w:r>
+          </w:p>
+        </w:tc>
+      </w:tr>
+      <w:tr>
+        <w:tc>
+          <w:tcPr>
+            <w:tcW w:type="dxa" w:w="700"/>
+            <w:tcBorders>
+              <w:top w:val="single" w:color="C9D3E0" w:sz="1"/>
+              <w:left w:val="single" w:color="C9D3E0" w:sz="1"/>
+              <w:bottom w:val="single" w:color="C9D3E0" w:sz="1"/>
+              <w:right w:val="single" w:color="C9D3E0" w:sz="1"/>
+            </w:tcBorders>
+            <w:shd w:fill="FFFFFF" w:color="auto" w:val="clear"/>
+            <w:tcMar>
+              <w:top w:type="dxa" w:w="60"/>
+              <w:left w:type="dxa" w:w="110"/>
+              <w:bottom w:type="dxa" w:w="60"/>
+              <w:right w:type="dxa" w:w="110"/>
+            </w:tcMar>
+            <w:vAlign w:val="center"/>
+          </w:tcPr>
+          <w:p>
+            <w:pPr>
+              <w:spacing w:line="252"/>
+            </w:pPr>
+            <w:r>
+              <w:rPr>
+                <w:rFonts w:ascii="Prompt" w:cs="Prompt" w:eastAsia="Prompt" w:hAnsi="Prompt"/>
+                <w:color w:val="1A1A1A"/>
+                <w:sz w:val="17"/>
+                <w:szCs w:val="17"/>
+              </w:rPr>
+              <w:t xml:space="preserve">4c</w:t>
+            </w:r>
+          </w:p>
+        </w:tc>
+        <w:tc>
+          <w:tcPr>
+            <w:tcW w:type="dxa" w:w="4760"/>
+            <w:tcBorders>
+              <w:top w:val="single" w:color="C9D3E0" w:sz="1"/>
+              <w:left w:val="single" w:color="C9D3E0" w:sz="1"/>
+              <w:bottom w:val="single" w:color="C9D3E0" w:sz="1"/>
+              <w:right w:val="single" w:color="C9D3E0" w:sz="1"/>
+            </w:tcBorders>
+            <w:shd w:fill="FFFFFF" w:color="auto" w:val="clear"/>
+            <w:tcMar>
+              <w:top w:type="dxa" w:w="60"/>
+              <w:left w:type="dxa" w:w="110"/>
+              <w:bottom w:type="dxa" w:w="60"/>
+              <w:right w:type="dxa" w:w="110"/>
+            </w:tcMar>
+            <w:vAlign w:val="center"/>
+          </w:tcPr>
+          <w:p>
+            <w:pPr>
+              <w:spacing w:line="252"/>
+            </w:pPr>
+            <w:r>
+              <w:rPr>
+                <w:rFonts w:ascii="Prompt" w:cs="Prompt" w:eastAsia="Prompt" w:hAnsi="Prompt"/>
+                <w:color w:val="1A1A1A"/>
+                <w:sz w:val="17"/>
+                <w:szCs w:val="17"/>
+              </w:rPr>
+              <w:t xml:space="preserve">TruckScale live connection (MySQL 192.168.1.253)</w:t>
+            </w:r>
+          </w:p>
+        </w:tc>
+        <w:tc>
+          <w:tcPr>
+            <w:tcW w:type="dxa" w:w="1700"/>
+            <w:tcBorders>
+              <w:top w:val="single" w:color="C9D3E0" w:sz="1"/>
+              <w:left w:val="single" w:color="C9D3E0" w:sz="1"/>
+              <w:bottom w:val="single" w:color="C9D3E0" w:sz="1"/>
+              <w:right w:val="single" w:color="C9D3E0" w:sz="1"/>
+            </w:tcBorders>
+            <w:shd w:fill="FFFFFF" w:color="auto" w:val="clear"/>
+            <w:tcMar>
+              <w:top w:type="dxa" w:w="60"/>
+              <w:left w:type="dxa" w:w="110"/>
+              <w:bottom w:type="dxa" w:w="60"/>
+              <w:right w:type="dxa" w:w="110"/>
+            </w:tcMar>
+            <w:vAlign w:val="center"/>
+          </w:tcPr>
+          <w:p>
+            <w:pPr>
+              <w:spacing w:line="252"/>
+            </w:pPr>
+            <w:r>
+              <w:rPr>
+                <w:rFonts w:ascii="Prompt" w:cs="Prompt" w:eastAsia="Prompt" w:hAnsi="Prompt"/>
+                <w:color w:val="1A1A1A"/>
+                <w:sz w:val="17"/>
+                <w:szCs w:val="17"/>
+              </w:rPr>
+              <w:t xml:space="preserve">FR-024/025/026</w:t>
+            </w:r>
+          </w:p>
+        </w:tc>
+        <w:tc>
+          <w:tcPr>
+            <w:tcW w:type="dxa" w:w="2200"/>
+            <w:tcBorders>
+              <w:top w:val="single" w:color="C9D3E0" w:sz="1"/>
+              <w:left w:val="single" w:color="C9D3E0" w:sz="1"/>
+              <w:bottom w:val="single" w:color="C9D3E0" w:sz="1"/>
+              <w:right w:val="single" w:color="C9D3E0" w:sz="1"/>
+            </w:tcBorders>
+            <w:shd w:fill="FFFFFF" w:color="auto" w:val="clear"/>
+            <w:tcMar>
+              <w:top w:type="dxa" w:w="60"/>
+              <w:left w:type="dxa" w:w="110"/>
+              <w:bottom w:type="dxa" w:w="60"/>
+              <w:right w:type="dxa" w:w="110"/>
+            </w:tcMar>
+            <w:vAlign w:val="center"/>
+          </w:tcPr>
+          <w:p>
+            <w:pPr>
+              <w:spacing w:line="252"/>
+            </w:pPr>
+            <w:r>
+              <w:rPr>
+                <w:rFonts w:ascii="Prompt" w:cs="Prompt" w:eastAsia="Prompt" w:hAnsi="Prompt"/>
+                <w:color w:val="1A1A1A"/>
+                <w:sz w:val="17"/>
+                <w:szCs w:val="17"/>
+              </w:rPr>
+              <w:t xml:space="preserve">⏳ รอ VPN</w:t>
+            </w:r>
+          </w:p>
+        </w:tc>
+      </w:tr>
+    </w:tbl>
+    <w:p/>
+    <w:p>
+      <w:pPr>
+        <w:pStyle w:val="Heading2"/>
+        <w:spacing w:after="120" w:before="240"/>
+      </w:pPr>
+      <w:r>
+        <w:rPr>
+          <w:rFonts w:ascii="Prompt" w:cs="Prompt" w:eastAsia="Prompt" w:hAnsi="Prompt"/>
+          <w:b/>
+          <w:bCs/>
+          <w:color w:val="1F3864"/>
+          <w:sz w:val="24"/>
+          <w:szCs w:val="24"/>
+        </w:rPr>
+        <w:t xml:space="preserve">17.2 ตาราง wf + Endpoint ที่เพิ่ม</w:t>
+      </w:r>
+    </w:p>
+    <w:tbl>
+      <w:tblPr>
+        <w:tblW w:type="dxa" w:w="9360"/>
+        <w:tblBorders>
+          <w:top w:val="single" w:color="auto" w:sz="4"/>
+          <w:left w:val="single" w:color="auto" w:sz="4"/>
+          <w:bottom w:val="single" w:color="auto" w:sz="4"/>
+          <w:right w:val="single" w:color="auto" w:sz="4"/>
+          <w:insideH w:val="single" w:color="auto" w:sz="4"/>
+          <w:insideV w:val="single" w:color="auto" w:sz="4"/>
+        </w:tblBorders>
+      </w:tblPr>
+      <w:tblGrid>
+        <w:gridCol w:w="4360"/>
+        <w:gridCol w:w="5000"/>
+      </w:tblGrid>
+      <w:tr>
+        <w:trPr>
+          <w:tblHeader/>
+        </w:trPr>
+        <w:tc>
+          <w:tcPr>
+            <w:tcW w:type="dxa" w:w="4360"/>
+            <w:tcBorders>
+              <w:top w:val="single" w:color="1F3864" w:sz="1"/>
+              <w:left w:val="single" w:color="1F3864" w:sz="1"/>
+              <w:bottom w:val="single" w:color="1F3864" w:sz="1"/>
+              <w:right w:val="single" w:color="1F3864" w:sz="1"/>
+            </w:tcBorders>
+            <w:shd w:fill="1F3864" w:color="auto" w:val="clear"/>
+            <w:tcMar>
+              <w:top w:type="dxa" w:w="60"/>
+              <w:left w:type="dxa" w:w="110"/>
+              <w:bottom w:type="dxa" w:w="60"/>
+              <w:right w:type="dxa" w:w="110"/>
+            </w:tcMar>
+            <w:vAlign w:val="center"/>
+          </w:tcPr>
+          <w:p>
+            <w:pPr>
+              <w:spacing w:line="252"/>
+            </w:pPr>
+            <w:r>
+              <w:rPr>
+                <w:rFonts w:ascii="Prompt" w:cs="Prompt" w:eastAsia="Prompt" w:hAnsi="Prompt"/>
+                <w:b/>
+                <w:bCs/>
+                <w:color w:val="FFFFFF"/>
+                <w:sz w:val="18"/>
+                <w:szCs w:val="18"/>
+              </w:rPr>
+              <w:t xml:space="preserve">Migration / ตาราง</w:t>
+            </w:r>
+          </w:p>
+        </w:tc>
+        <w:tc>
+          <w:tcPr>
+            <w:tcW w:type="dxa" w:w="5000"/>
+            <w:tcBorders>
+              <w:top w:val="single" w:color="1F3864" w:sz="1"/>
+              <w:left w:val="single" w:color="1F3864" w:sz="1"/>
+              <w:bottom w:val="single" w:color="1F3864" w:sz="1"/>
+              <w:right w:val="single" w:color="1F3864" w:sz="1"/>
+            </w:tcBorders>
+            <w:shd w:fill="1F3864" w:color="auto" w:val="clear"/>
+            <w:tcMar>
+              <w:top w:type="dxa" w:w="60"/>
+              <w:left w:type="dxa" w:w="110"/>
+              <w:bottom w:type="dxa" w:w="60"/>
+              <w:right w:type="dxa" w:w="110"/>
+            </w:tcMar>
+            <w:vAlign w:val="center"/>
+          </w:tcPr>
+          <w:p>
+            <w:pPr>
+              <w:spacing w:line="252"/>
+            </w:pPr>
+            <w:r>
+              <w:rPr>
+                <w:rFonts w:ascii="Prompt" w:cs="Prompt" w:eastAsia="Prompt" w:hAnsi="Prompt"/>
+                <w:b/>
+                <w:bCs/>
+                <w:color w:val="FFFFFF"/>
+                <w:sz w:val="18"/>
+                <w:szCs w:val="18"/>
+              </w:rPr>
+              <w:t xml:space="preserve">Endpoint หลัก</w:t>
+            </w:r>
+          </w:p>
+        </w:tc>
+      </w:tr>
+      <w:tr>
+        <w:tc>
+          <w:tcPr>
+            <w:tcW w:type="dxa" w:w="4360"/>
+            <w:tcBorders>
+              <w:top w:val="single" w:color="C9D3E0" w:sz="1"/>
+              <w:left w:val="single" w:color="C9D3E0" w:sz="1"/>
+              <w:bottom w:val="single" w:color="C9D3E0" w:sz="1"/>
+              <w:right w:val="single" w:color="C9D3E0" w:sz="1"/>
+            </w:tcBorders>
+            <w:shd w:fill="FFFFFF" w:color="auto" w:val="clear"/>
+            <w:tcMar>
+              <w:top w:type="dxa" w:w="60"/>
+              <w:left w:type="dxa" w:w="110"/>
+              <w:bottom w:type="dxa" w:w="60"/>
+              <w:right w:type="dxa" w:w="110"/>
+            </w:tcMar>
+            <w:vAlign w:val="center"/>
+          </w:tcPr>
+          <w:p>
+            <w:pPr>
+              <w:spacing w:line="252"/>
+            </w:pPr>
+            <w:r>
+              <w:rPr>
+                <w:rFonts w:ascii="Prompt" w:cs="Prompt" w:eastAsia="Prompt" w:hAnsi="Prompt"/>
+                <w:color w:val="1A1A1A"/>
+                <w:sz w:val="17"/>
+                <w:szCs w:val="17"/>
+              </w:rPr>
+              <w:t xml:space="preserve">016 wf.PaperCopy + wf.PaperScan</w:t>
+            </w:r>
+          </w:p>
+        </w:tc>
+        <w:tc>
+          <w:tcPr>
+            <w:tcW w:type="dxa" w:w="5000"/>
+            <w:tcBorders>
+              <w:top w:val="single" w:color="C9D3E0" w:sz="1"/>
+              <w:left w:val="single" w:color="C9D3E0" w:sz="1"/>
+              <w:bottom w:val="single" w:color="C9D3E0" w:sz="1"/>
+              <w:right w:val="single" w:color="C9D3E0" w:sz="1"/>
+            </w:tcBorders>
+            <w:shd w:fill="FFFFFF" w:color="auto" w:val="clear"/>
+            <w:tcMar>
+              <w:top w:type="dxa" w:w="60"/>
+              <w:left w:type="dxa" w:w="110"/>
+              <w:bottom w:type="dxa" w:w="60"/>
+              <w:right w:type="dxa" w:w="110"/>
+            </w:tcMar>
+            <w:vAlign w:val="center"/>
+          </w:tcPr>
+          <w:p>
+            <w:pPr>
+              <w:spacing w:line="252"/>
+            </w:pPr>
+            <w:r>
+              <w:rPr>
+                <w:rFonts w:ascii="Prompt" w:cs="Prompt" w:eastAsia="Prompt" w:hAnsi="Prompt"/>
+                <w:color w:val="1A1A1A"/>
+                <w:sz w:val="17"/>
+                <w:szCs w:val="17"/>
+              </w:rPr>
+              <w:t xml:space="preserve">/papertrail/:so/print · /scan · /:so/copies · /lost</w:t>
+            </w:r>
+          </w:p>
+        </w:tc>
+      </w:tr>
+      <w:tr>
+        <w:tc>
+          <w:tcPr>
+            <w:tcW w:type="dxa" w:w="4360"/>
+            <w:tcBorders>
+              <w:top w:val="single" w:color="C9D3E0" w:sz="1"/>
+              <w:left w:val="single" w:color="C9D3E0" w:sz="1"/>
+              <w:bottom w:val="single" w:color="C9D3E0" w:sz="1"/>
+              <w:right w:val="single" w:color="C9D3E0" w:sz="1"/>
+            </w:tcBorders>
+            <w:shd w:fill="FFFFFF" w:color="auto" w:val="clear"/>
+            <w:tcMar>
+              <w:top w:type="dxa" w:w="60"/>
+              <w:left w:type="dxa" w:w="110"/>
+              <w:bottom w:type="dxa" w:w="60"/>
+              <w:right w:type="dxa" w:w="110"/>
+            </w:tcMar>
+            <w:vAlign w:val="center"/>
+          </w:tcPr>
+          <w:p>
+            <w:pPr>
+              <w:spacing w:line="252"/>
+            </w:pPr>
+            <w:r>
+              <w:rPr>
+                <w:rFonts w:ascii="Prompt" w:cs="Prompt" w:eastAsia="Prompt" w:hAnsi="Prompt"/>
+                <w:color w:val="1A1A1A"/>
+                <w:sz w:val="17"/>
+                <w:szCs w:val="17"/>
+              </w:rPr>
+              <w:t xml:space="preserve">017 wf.RebatePlan + RebatePlanAllocation (+PlanId/Region ใน RebateLedger)</w:t>
+            </w:r>
+          </w:p>
+        </w:tc>
+        <w:tc>
+          <w:tcPr>
+            <w:tcW w:type="dxa" w:w="5000"/>
+            <w:tcBorders>
+              <w:top w:val="single" w:color="C9D3E0" w:sz="1"/>
+              <w:left w:val="single" w:color="C9D3E0" w:sz="1"/>
+              <w:bottom w:val="single" w:color="C9D3E0" w:sz="1"/>
+              <w:right w:val="single" w:color="C9D3E0" w:sz="1"/>
+            </w:tcBorders>
+            <w:shd w:fill="FFFFFF" w:color="auto" w:val="clear"/>
+            <w:tcMar>
+              <w:top w:type="dxa" w:w="60"/>
+              <w:left w:type="dxa" w:w="110"/>
+              <w:bottom w:type="dxa" w:w="60"/>
+              <w:right w:type="dxa" w:w="110"/>
+            </w:tcMar>
+            <w:vAlign w:val="center"/>
+          </w:tcPr>
+          <w:p>
+            <w:pPr>
+              <w:spacing w:line="252"/>
+            </w:pPr>
+            <w:r>
+              <w:rPr>
+                <w:rFonts w:ascii="Prompt" w:cs="Prompt" w:eastAsia="Prompt" w:hAnsi="Prompt"/>
+                <w:color w:val="1A1A1A"/>
+                <w:sz w:val="17"/>
+                <w:szCs w:val="17"/>
+              </w:rPr>
+              <w:t xml:space="preserve">/rebate/plans (CRUD) · /plans/:id/allocate</w:t>
+            </w:r>
+          </w:p>
+        </w:tc>
+      </w:tr>
+      <w:tr>
+        <w:tc>
+          <w:tcPr>
+            <w:tcW w:type="dxa" w:w="4360"/>
+            <w:tcBorders>
+              <w:top w:val="single" w:color="C9D3E0" w:sz="1"/>
+              <w:left w:val="single" w:color="C9D3E0" w:sz="1"/>
+              <w:bottom w:val="single" w:color="C9D3E0" w:sz="1"/>
+              <w:right w:val="single" w:color="C9D3E0" w:sz="1"/>
+            </w:tcBorders>
+            <w:shd w:fill="FFFFFF" w:color="auto" w:val="clear"/>
+            <w:tcMar>
+              <w:top w:type="dxa" w:w="60"/>
+              <w:left w:type="dxa" w:w="110"/>
+              <w:bottom w:type="dxa" w:w="60"/>
+              <w:right w:type="dxa" w:w="110"/>
+            </w:tcMar>
+            <w:vAlign w:val="center"/>
+          </w:tcPr>
+          <w:p>
+            <w:pPr>
+              <w:spacing w:line="252"/>
+            </w:pPr>
+            <w:r>
+              <w:rPr>
+                <w:rFonts w:ascii="Prompt" w:cs="Prompt" w:eastAsia="Prompt" w:hAnsi="Prompt"/>
+                <w:color w:val="1A1A1A"/>
+                <w:sz w:val="17"/>
+                <w:szCs w:val="17"/>
+              </w:rPr>
+              <w:t xml:space="preserve">018 wf.SalesOrder.VerifiedBy/At + wf.UnlockRequest</w:t>
+            </w:r>
+          </w:p>
+        </w:tc>
+        <w:tc>
+          <w:tcPr>
+            <w:tcW w:type="dxa" w:w="5000"/>
+            <w:tcBorders>
+              <w:top w:val="single" w:color="C9D3E0" w:sz="1"/>
+              <w:left w:val="single" w:color="C9D3E0" w:sz="1"/>
+              <w:bottom w:val="single" w:color="C9D3E0" w:sz="1"/>
+              <w:right w:val="single" w:color="C9D3E0" w:sz="1"/>
+            </w:tcBorders>
+            <w:shd w:fill="FFFFFF" w:color="auto" w:val="clear"/>
+            <w:tcMar>
+              <w:top w:type="dxa" w:w="60"/>
+              <w:left w:type="dxa" w:w="110"/>
+              <w:bottom w:type="dxa" w:w="60"/>
+              <w:right w:type="dxa" w:w="110"/>
+            </w:tcMar>
+            <w:vAlign w:val="center"/>
+          </w:tcPr>
+          <w:p>
+            <w:pPr>
+              <w:spacing w:line="252"/>
+            </w:pPr>
+            <w:r>
+              <w:rPr>
+                <w:rFonts w:ascii="Prompt" w:cs="Prompt" w:eastAsia="Prompt" w:hAnsi="Prompt"/>
+                <w:color w:val="1A1A1A"/>
+                <w:sz w:val="17"/>
+                <w:szCs w:val="17"/>
+              </w:rPr>
+              <w:t xml:space="preserve">/so/:id/verify · /so/:id/unlock-request · /so/unlock-requests · /resolve</w:t>
+            </w:r>
+          </w:p>
+        </w:tc>
+      </w:tr>
+      <w:tr>
+        <w:tc>
+          <w:tcPr>
+            <w:tcW w:type="dxa" w:w="4360"/>
+            <w:tcBorders>
+              <w:top w:val="single" w:color="C9D3E0" w:sz="1"/>
+              <w:left w:val="single" w:color="C9D3E0" w:sz="1"/>
+              <w:bottom w:val="single" w:color="C9D3E0" w:sz="1"/>
+              <w:right w:val="single" w:color="C9D3E0" w:sz="1"/>
+            </w:tcBorders>
+            <w:shd w:fill="FFFFFF" w:color="auto" w:val="clear"/>
+            <w:tcMar>
+              <w:top w:type="dxa" w:w="60"/>
+              <w:left w:type="dxa" w:w="110"/>
+              <w:bottom w:type="dxa" w:w="60"/>
+              <w:right w:type="dxa" w:w="110"/>
+            </w:tcMar>
+            <w:vAlign w:val="center"/>
+          </w:tcPr>
+          <w:p>
+            <w:pPr>
+              <w:spacing w:line="252"/>
+            </w:pPr>
+            <w:r>
+              <w:rPr>
+                <w:rFonts w:ascii="Prompt" w:cs="Prompt" w:eastAsia="Prompt" w:hAnsi="Prompt"/>
+                <w:color w:val="1A1A1A"/>
+                <w:sz w:val="17"/>
+                <w:szCs w:val="17"/>
+              </w:rPr>
+              <w:t xml:space="preserve">019 wf.WeighTicket</w:t>
+            </w:r>
+          </w:p>
+        </w:tc>
+        <w:tc>
+          <w:tcPr>
+            <w:tcW w:type="dxa" w:w="5000"/>
+            <w:tcBorders>
+              <w:top w:val="single" w:color="C9D3E0" w:sz="1"/>
+              <w:left w:val="single" w:color="C9D3E0" w:sz="1"/>
+              <w:bottom w:val="single" w:color="C9D3E0" w:sz="1"/>
+              <w:right w:val="single" w:color="C9D3E0" w:sz="1"/>
+            </w:tcBorders>
+            <w:shd w:fill="FFFFFF" w:color="auto" w:val="clear"/>
+            <w:tcMar>
+              <w:top w:type="dxa" w:w="60"/>
+              <w:left w:type="dxa" w:w="110"/>
+              <w:bottom w:type="dxa" w:w="60"/>
+              <w:right w:type="dxa" w:w="110"/>
+            </w:tcMar>
+            <w:vAlign w:val="center"/>
+          </w:tcPr>
+          <w:p>
+            <w:pPr>
+              <w:spacing w:line="252"/>
+            </w:pPr>
+            <w:r>
+              <w:rPr>
+                <w:rFonts w:ascii="Prompt" w:cs="Prompt" w:eastAsia="Prompt" w:hAnsi="Prompt"/>
+                <w:color w:val="1A1A1A"/>
+                <w:sz w:val="17"/>
+                <w:szCs w:val="17"/>
+              </w:rPr>
+              <w:t xml:space="preserve">/so/:id/ship (บันทึก gross/tare/net) · /so/:id/weigh</w:t>
+            </w:r>
+          </w:p>
+        </w:tc>
+      </w:tr>
+      <w:tr>
+        <w:tc>
+          <w:tcPr>
+            <w:tcW w:type="dxa" w:w="4360"/>
+            <w:tcBorders>
+              <w:top w:val="single" w:color="C9D3E0" w:sz="1"/>
+              <w:left w:val="single" w:color="C9D3E0" w:sz="1"/>
+              <w:bottom w:val="single" w:color="C9D3E0" w:sz="1"/>
+              <w:right w:val="single" w:color="C9D3E0" w:sz="1"/>
+            </w:tcBorders>
+            <w:shd w:fill="FFFFFF" w:color="auto" w:val="clear"/>
+            <w:tcMar>
+              <w:top w:type="dxa" w:w="60"/>
+              <w:left w:type="dxa" w:w="110"/>
+              <w:bottom w:type="dxa" w:w="60"/>
+              <w:right w:type="dxa" w:w="110"/>
+            </w:tcMar>
+            <w:vAlign w:val="center"/>
+          </w:tcPr>
+          <w:p>
+            <w:pPr>
+              <w:spacing w:line="252"/>
+            </w:pPr>
+            <w:r>
+              <w:rPr>
+                <w:rFonts w:ascii="Prompt" w:cs="Prompt" w:eastAsia="Prompt" w:hAnsi="Prompt"/>
+                <w:color w:val="1A1A1A"/>
+                <w:sz w:val="17"/>
+                <w:szCs w:val="17"/>
+              </w:rPr>
+              <w:t xml:space="preserve">(ไม่มี migration) Control Ticket + Reports</w:t>
+            </w:r>
+          </w:p>
+        </w:tc>
+        <w:tc>
+          <w:tcPr>
+            <w:tcW w:type="dxa" w:w="5000"/>
+            <w:tcBorders>
+              <w:top w:val="single" w:color="C9D3E0" w:sz="1"/>
+              <w:left w:val="single" w:color="C9D3E0" w:sz="1"/>
+              <w:bottom w:val="single" w:color="C9D3E0" w:sz="1"/>
+              <w:right w:val="single" w:color="C9D3E0" w:sz="1"/>
+            </w:tcBorders>
+            <w:shd w:fill="FFFFFF" w:color="auto" w:val="clear"/>
+            <w:tcMar>
+              <w:top w:type="dxa" w:w="60"/>
+              <w:left w:type="dxa" w:w="110"/>
+              <w:bottom w:type="dxa" w:w="60"/>
+              <w:right w:type="dxa" w:w="110"/>
+            </w:tcMar>
+            <w:vAlign w:val="center"/>
+          </w:tcPr>
+          <w:p>
+            <w:pPr>
+              <w:spacing w:line="252"/>
+            </w:pPr>
+            <w:r>
+              <w:rPr>
+                <w:rFonts w:ascii="Prompt" w:cs="Prompt" w:eastAsia="Prompt" w:hAnsi="Prompt"/>
+                <w:color w:val="1A1A1A"/>
+                <w:sz w:val="17"/>
+                <w:szCs w:val="17"/>
+              </w:rPr>
+              <w:t xml:space="preserve">/master/control-tickets/:no/draws · /reports/:type · /reports/:type/export</w:t>
+            </w:r>
+          </w:p>
+        </w:tc>
+      </w:tr>
+    </w:tbl>
+    <w:p/>
+    <w:p>
+      <w:pPr>
+        <w:pStyle w:val="Heading2"/>
+        <w:spacing w:after="120" w:before="240"/>
+      </w:pPr>
+      <w:r>
+        <w:rPr>
+          <w:rFonts w:ascii="Prompt" w:cs="Prompt" w:eastAsia="Prompt" w:hAnsi="Prompt"/>
+          <w:b/>
+          <w:bCs/>
+          <w:color w:val="1F3864"/>
+          <w:sz w:val="24"/>
+          <w:szCs w:val="24"/>
+        </w:rPr>
+        <w:t xml:space="preserve">17.3 การตัดสินใจสำคัญ — dbo Write Strategy (อัปเดต D-03 / FR-015)</w:t>
+      </w:r>
+    </w:p>
+    <w:p>
+      <w:pPr>
+        <w:spacing w:after="80" w:line="276"/>
+      </w:pPr>
+      <w:r>
+        <w:rPr>
+          <w:rFonts w:ascii="Prompt" w:cs="Prompt" w:eastAsia="Prompt" w:hAnsi="Prompt"/>
+          <w:b/>
+          <w:bCs/>
+          <w:color w:val="A32D2D"/>
+          <w:sz w:val="18"/>
+          <w:szCs w:val="18"/>
+        </w:rPr>
+        <w:t xml:space="preserve">เดิม D-03 (แนวทาง B) ระบุ "ห้ามเขียน dbo · ส่งผ่าน WINSpeed Import (SOHD/SODT.TXT)" แต่ทีมตัดสินใจใช้แนวทางที่ implement จริง:</w:t>
+      </w:r>
+    </w:p>
+    <w:tbl>
+      <w:tblPr>
+        <w:tblW w:type="dxa" w:w="9360"/>
+        <w:tblBorders>
+          <w:top w:val="single" w:color="auto" w:sz="4"/>
+          <w:left w:val="single" w:color="auto" w:sz="4"/>
+          <w:bottom w:val="single" w:color="auto" w:sz="4"/>
+          <w:right w:val="single" w:color="auto" w:sz="4"/>
+          <w:insideH w:val="single" w:color="auto" w:sz="4"/>
+          <w:insideV w:val="single" w:color="auto" w:sz="4"/>
+        </w:tblBorders>
+      </w:tblPr>
+      <w:tblGrid>
+        <w:gridCol w:w="3000"/>
+        <w:gridCol w:w="6360"/>
+      </w:tblGrid>
+      <w:tr>
+        <w:trPr>
+          <w:tblHeader/>
+        </w:trPr>
+        <w:tc>
+          <w:tcPr>
+            <w:tcW w:type="dxa" w:w="3000"/>
+            <w:tcBorders>
+              <w:top w:val="single" w:color="1F3864" w:sz="1"/>
+              <w:left w:val="single" w:color="1F3864" w:sz="1"/>
+              <w:bottom w:val="single" w:color="1F3864" w:sz="1"/>
+              <w:right w:val="single" w:color="1F3864" w:sz="1"/>
+            </w:tcBorders>
+            <w:shd w:fill="1F3864" w:color="auto" w:val="clear"/>
+            <w:tcMar>
+              <w:top w:type="dxa" w:w="60"/>
+              <w:left w:type="dxa" w:w="110"/>
+              <w:bottom w:type="dxa" w:w="60"/>
+              <w:right w:type="dxa" w:w="110"/>
+            </w:tcMar>
+            <w:vAlign w:val="center"/>
+          </w:tcPr>
+          <w:p>
+            <w:pPr>
+              <w:spacing w:line="252"/>
+            </w:pPr>
+            <w:r>
+              <w:rPr>
+                <w:rFonts w:ascii="Prompt" w:cs="Prompt" w:eastAsia="Prompt" w:hAnsi="Prompt"/>
+                <w:b/>
+                <w:bCs/>
+                <w:color w:val="FFFFFF"/>
+                <w:sz w:val="18"/>
+                <w:szCs w:val="18"/>
+              </w:rPr>
+              <w:t xml:space="preserve">หัวข้อ</w:t>
+            </w:r>
+          </w:p>
+        </w:tc>
+        <w:tc>
+          <w:tcPr>
+            <w:tcW w:type="dxa" w:w="6360"/>
+            <w:tcBorders>
+              <w:top w:val="single" w:color="1F3864" w:sz="1"/>
+              <w:left w:val="single" w:color="1F3864" w:sz="1"/>
+              <w:bottom w:val="single" w:color="1F3864" w:sz="1"/>
+              <w:right w:val="single" w:color="1F3864" w:sz="1"/>
+            </w:tcBorders>
+            <w:shd w:fill="1F3864" w:color="auto" w:val="clear"/>
+            <w:tcMar>
+              <w:top w:type="dxa" w:w="60"/>
+              <w:left w:type="dxa" w:w="110"/>
+              <w:bottom w:type="dxa" w:w="60"/>
+              <w:right w:type="dxa" w:w="110"/>
+            </w:tcMar>
+            <w:vAlign w:val="center"/>
+          </w:tcPr>
+          <w:p>
+            <w:pPr>
+              <w:spacing w:line="252"/>
+            </w:pPr>
+            <w:r>
+              <w:rPr>
+                <w:rFonts w:ascii="Prompt" w:cs="Prompt" w:eastAsia="Prompt" w:hAnsi="Prompt"/>
+                <w:b/>
+                <w:bCs/>
+                <w:color w:val="FFFFFF"/>
+                <w:sz w:val="18"/>
+                <w:szCs w:val="18"/>
+              </w:rPr>
+              <w:t xml:space="preserve">การตัดสินใจ (v6.1)</w:t>
+            </w:r>
+          </w:p>
+        </w:tc>
+      </w:tr>
+      <w:tr>
+        <w:tc>
+          <w:tcPr>
+            <w:tcW w:type="dxa" w:w="3000"/>
+            <w:tcBorders>
+              <w:top w:val="single" w:color="C9D3E0" w:sz="1"/>
+              <w:left w:val="single" w:color="C9D3E0" w:sz="1"/>
+              <w:bottom w:val="single" w:color="C9D3E0" w:sz="1"/>
+              <w:right w:val="single" w:color="C9D3E0" w:sz="1"/>
+            </w:tcBorders>
+            <w:shd w:fill="FFFFFF" w:color="auto" w:val="clear"/>
+            <w:tcMar>
+              <w:top w:type="dxa" w:w="60"/>
+              <w:left w:type="dxa" w:w="110"/>
+              <w:bottom w:type="dxa" w:w="60"/>
+              <w:right w:type="dxa" w:w="110"/>
+            </w:tcMar>
+            <w:vAlign w:val="center"/>
+          </w:tcPr>
+          <w:p>
+            <w:pPr>
+              <w:spacing w:line="252"/>
+            </w:pPr>
+            <w:r>
+              <w:rPr>
+                <w:rFonts w:ascii="Prompt" w:cs="Prompt" w:eastAsia="Prompt" w:hAnsi="Prompt"/>
+                <w:color w:val="1A1A1A"/>
+                <w:sz w:val="17"/>
+                <w:szCs w:val="17"/>
+              </w:rPr>
+              <w:t xml:space="preserve">confirm / picking / ship / cancel</w:t>
+            </w:r>
+          </w:p>
+        </w:tc>
+        <w:tc>
+          <w:tcPr>
+            <w:tcW w:type="dxa" w:w="6360"/>
+            <w:tcBorders>
+              <w:top w:val="single" w:color="C9D3E0" w:sz="1"/>
+              <w:left w:val="single" w:color="C9D3E0" w:sz="1"/>
+              <w:bottom w:val="single" w:color="C9D3E0" w:sz="1"/>
+              <w:right w:val="single" w:color="C9D3E0" w:sz="1"/>
+            </w:tcBorders>
+            <w:shd w:fill="FFFFFF" w:color="auto" w:val="clear"/>
+            <w:tcMar>
+              <w:top w:type="dxa" w:w="60"/>
+              <w:left w:type="dxa" w:w="110"/>
+              <w:bottom w:type="dxa" w:w="60"/>
+              <w:right w:type="dxa" w:w="110"/>
+            </w:tcMar>
+            <w:vAlign w:val="center"/>
+          </w:tcPr>
+          <w:p>
+            <w:pPr>
+              <w:spacing w:line="252"/>
+            </w:pPr>
+            <w:r>
+              <w:rPr>
+                <w:rFonts w:ascii="Prompt" w:cs="Prompt" w:eastAsia="Prompt" w:hAnsi="Prompt"/>
+                <w:color w:val="1A1A1A"/>
+                <w:sz w:val="17"/>
+                <w:szCs w:val="17"/>
+              </w:rPr>
+              <w:t xml:space="preserve">เขียน dbo.SOHD/SODT ตรง (sp_ConfirmSalesOrder INSERT, UPDATE PkgStatus/clearflag/DocuStatus)</w:t>
+            </w:r>
+          </w:p>
+        </w:tc>
+      </w:tr>
+      <w:tr>
+        <w:tc>
+          <w:tcPr>
+            <w:tcW w:type="dxa" w:w="3000"/>
+            <w:tcBorders>
+              <w:top w:val="single" w:color="C9D3E0" w:sz="1"/>
+              <w:left w:val="single" w:color="C9D3E0" w:sz="1"/>
+              <w:bottom w:val="single" w:color="C9D3E0" w:sz="1"/>
+              <w:right w:val="single" w:color="C9D3E0" w:sz="1"/>
+            </w:tcBorders>
+            <w:shd w:fill="FFFFFF" w:color="auto" w:val="clear"/>
+            <w:tcMar>
+              <w:top w:type="dxa" w:w="60"/>
+              <w:left w:type="dxa" w:w="110"/>
+              <w:bottom w:type="dxa" w:w="60"/>
+              <w:right w:type="dxa" w:w="110"/>
+            </w:tcMar>
+            <w:vAlign w:val="center"/>
+          </w:tcPr>
+          <w:p>
+            <w:pPr>
+              <w:spacing w:line="252"/>
+            </w:pPr>
+            <w:r>
+              <w:rPr>
+                <w:rFonts w:ascii="Prompt" w:cs="Prompt" w:eastAsia="Prompt" w:hAnsi="Prompt"/>
+                <w:color w:val="1A1A1A"/>
+                <w:sz w:val="17"/>
+                <w:szCs w:val="17"/>
+              </w:rPr>
+              <w:t xml:space="preserve">การลงบัญชี (GL)</w:t>
+            </w:r>
+          </w:p>
+        </w:tc>
+        <w:tc>
+          <w:tcPr>
+            <w:tcW w:type="dxa" w:w="6360"/>
+            <w:tcBorders>
+              <w:top w:val="single" w:color="C9D3E0" w:sz="1"/>
+              <w:left w:val="single" w:color="C9D3E0" w:sz="1"/>
+              <w:bottom w:val="single" w:color="C9D3E0" w:sz="1"/>
+              <w:right w:val="single" w:color="C9D3E0" w:sz="1"/>
+            </w:tcBorders>
+            <w:shd w:fill="FFFFFF" w:color="auto" w:val="clear"/>
+            <w:tcMar>
+              <w:top w:type="dxa" w:w="60"/>
+              <w:left w:type="dxa" w:w="110"/>
+              <w:bottom w:type="dxa" w:w="60"/>
+              <w:right w:type="dxa" w:w="110"/>
+            </w:tcMar>
+            <w:vAlign w:val="center"/>
+          </w:tcPr>
+          <w:p>
+            <w:pPr>
+              <w:spacing w:line="252"/>
+            </w:pPr>
+            <w:r>
+              <w:rPr>
+                <w:rFonts w:ascii="Prompt" w:cs="Prompt" w:eastAsia="Prompt" w:hAnsi="Prompt"/>
+                <w:color w:val="1A1A1A"/>
+                <w:sz w:val="17"/>
+                <w:szCs w:val="17"/>
+              </w:rPr>
+              <w:t xml:space="preserve">ยังให้ WINSpeed post เอง (Post Invoice WF) — dbo ไม่ใช่ READ-ONLY 100% แต่ GL ยังเป็นของ WINSpeed</w:t>
+            </w:r>
+          </w:p>
+        </w:tc>
+      </w:tr>
+      <w:tr>
+        <w:tc>
+          <w:tcPr>
+            <w:tcW w:type="dxa" w:w="3000"/>
+            <w:tcBorders>
+              <w:top w:val="single" w:color="C9D3E0" w:sz="1"/>
+              <w:left w:val="single" w:color="C9D3E0" w:sz="1"/>
+              <w:bottom w:val="single" w:color="C9D3E0" w:sz="1"/>
+              <w:right w:val="single" w:color="C9D3E0" w:sz="1"/>
+            </w:tcBorders>
+            <w:shd w:fill="FFFFFF" w:color="auto" w:val="clear"/>
+            <w:tcMar>
+              <w:top w:type="dxa" w:w="60"/>
+              <w:left w:type="dxa" w:w="110"/>
+              <w:bottom w:type="dxa" w:w="60"/>
+              <w:right w:type="dxa" w:w="110"/>
+            </w:tcMar>
+            <w:vAlign w:val="center"/>
+          </w:tcPr>
+          <w:p>
+            <w:pPr>
+              <w:spacing w:line="252"/>
+            </w:pPr>
+            <w:r>
+              <w:rPr>
+                <w:rFonts w:ascii="Prompt" w:cs="Prompt" w:eastAsia="Prompt" w:hAnsi="Prompt"/>
+                <w:color w:val="1A1A1A"/>
+                <w:sz w:val="17"/>
+                <w:szCs w:val="17"/>
+              </w:rPr>
+              <w:t xml:space="preserve">เหตุผล</w:t>
+            </w:r>
+          </w:p>
+        </w:tc>
+        <w:tc>
+          <w:tcPr>
+            <w:tcW w:type="dxa" w:w="6360"/>
+            <w:tcBorders>
+              <w:top w:val="single" w:color="C9D3E0" w:sz="1"/>
+              <w:left w:val="single" w:color="C9D3E0" w:sz="1"/>
+              <w:bottom w:val="single" w:color="C9D3E0" w:sz="1"/>
+              <w:right w:val="single" w:color="C9D3E0" w:sz="1"/>
+            </w:tcBorders>
+            <w:shd w:fill="FFFFFF" w:color="auto" w:val="clear"/>
+            <w:tcMar>
+              <w:top w:type="dxa" w:w="60"/>
+              <w:left w:type="dxa" w:w="110"/>
+              <w:bottom w:type="dxa" w:w="60"/>
+              <w:right w:type="dxa" w:w="110"/>
+            </w:tcMar>
+            <w:vAlign w:val="center"/>
+          </w:tcPr>
+          <w:p>
+            <w:pPr>
+              <w:spacing w:line="252"/>
+            </w:pPr>
+            <w:r>
+              <w:rPr>
+                <w:rFonts w:ascii="Prompt" w:cs="Prompt" w:eastAsia="Prompt" w:hAnsi="Prompt"/>
+                <w:color w:val="1A1A1A"/>
+                <w:sz w:val="17"/>
+                <w:szCs w:val="17"/>
+              </w:rPr>
+              <w:t xml:space="preserve">เร็ว/ตรงไปตรงมา ไม่ต้องตั้ง template Import — ยอมรับว่า App เขียน SOHD/SODT</w:t>
+            </w:r>
+          </w:p>
+        </w:tc>
+      </w:tr>
+    </w:tbl>
+    <w:p/>
+    <w:p>
+      <w:pPr>
+        <w:pStyle w:val="Heading2"/>
+        <w:spacing w:after="120" w:before="240"/>
+      </w:pPr>
+      <w:r>
+        <w:rPr>
+          <w:rFonts w:ascii="Prompt" w:cs="Prompt" w:eastAsia="Prompt" w:hAnsi="Prompt"/>
+          <w:b/>
+          <w:bCs/>
+          <w:color w:val="1F3864"/>
+          <w:sz w:val="24"/>
+          <w:szCs w:val="24"/>
+        </w:rPr>
+        <w:t xml:space="preserve">17.4 สถานะ FR ล่าสุด (Implemented)</w:t>
+      </w:r>
+    </w:p>
+    <w:tbl>
+      <w:tblPr>
+        <w:tblW w:type="dxa" w:w="9360"/>
+        <w:tblBorders>
+          <w:top w:val="single" w:color="auto" w:sz="4"/>
+          <w:left w:val="single" w:color="auto" w:sz="4"/>
+          <w:bottom w:val="single" w:color="auto" w:sz="4"/>
+          <w:right w:val="single" w:color="auto" w:sz="4"/>
+          <w:insideH w:val="single" w:color="auto" w:sz="4"/>
+          <w:insideV w:val="single" w:color="auto" w:sz="4"/>
+        </w:tblBorders>
+      </w:tblPr>
+      <w:tblGrid>
+        <w:gridCol w:w="1700"/>
+        <w:gridCol w:w="4660"/>
+        <w:gridCol w:w="3000"/>
+      </w:tblGrid>
+      <w:tr>
+        <w:trPr>
+          <w:tblHeader/>
+        </w:trPr>
+        <w:tc>
+          <w:tcPr>
+            <w:tcW w:type="dxa" w:w="1700"/>
+            <w:tcBorders>
+              <w:top w:val="single" w:color="1F3864" w:sz="1"/>
+              <w:left w:val="single" w:color="1F3864" w:sz="1"/>
+              <w:bottom w:val="single" w:color="1F3864" w:sz="1"/>
+              <w:right w:val="single" w:color="1F3864" w:sz="1"/>
+            </w:tcBorders>
+            <w:shd w:fill="1F3864" w:color="auto" w:val="clear"/>
+            <w:tcMar>
+              <w:top w:type="dxa" w:w="60"/>
+              <w:left w:type="dxa" w:w="110"/>
+              <w:bottom w:type="dxa" w:w="60"/>
+              <w:right w:type="dxa" w:w="110"/>
+            </w:tcMar>
+            <w:vAlign w:val="center"/>
+          </w:tcPr>
+          <w:p>
+            <w:pPr>
+              <w:spacing w:line="252"/>
+            </w:pPr>
+            <w:r>
+              <w:rPr>
+                <w:rFonts w:ascii="Prompt" w:cs="Prompt" w:eastAsia="Prompt" w:hAnsi="Prompt"/>
+                <w:b/>
+                <w:bCs/>
+                <w:color w:val="FFFFFF"/>
+                <w:sz w:val="18"/>
+                <w:szCs w:val="18"/>
+              </w:rPr>
+              <w:t xml:space="preserve">FR</w:t>
+            </w:r>
+          </w:p>
+        </w:tc>
+        <w:tc>
+          <w:tcPr>
+            <w:tcW w:type="dxa" w:w="4660"/>
+            <w:tcBorders>
+              <w:top w:val="single" w:color="1F3864" w:sz="1"/>
+              <w:left w:val="single" w:color="1F3864" w:sz="1"/>
+              <w:bottom w:val="single" w:color="1F3864" w:sz="1"/>
+              <w:right w:val="single" w:color="1F3864" w:sz="1"/>
+            </w:tcBorders>
+            <w:shd w:fill="1F3864" w:color="auto" w:val="clear"/>
+            <w:tcMar>
+              <w:top w:type="dxa" w:w="60"/>
+              <w:left w:type="dxa" w:w="110"/>
+              <w:bottom w:type="dxa" w:w="60"/>
+              <w:right w:type="dxa" w:w="110"/>
+            </w:tcMar>
+            <w:vAlign w:val="center"/>
+          </w:tcPr>
+          <w:p>
+            <w:pPr>
+              <w:spacing w:line="252"/>
+            </w:pPr>
+            <w:r>
+              <w:rPr>
+                <w:rFonts w:ascii="Prompt" w:cs="Prompt" w:eastAsia="Prompt" w:hAnsi="Prompt"/>
+                <w:b/>
+                <w:bCs/>
+                <w:color w:val="FFFFFF"/>
+                <w:sz w:val="18"/>
+                <w:szCs w:val="18"/>
+              </w:rPr>
+              <w:t xml:space="preserve">ชื่อ</w:t>
+            </w:r>
+          </w:p>
+        </w:tc>
+        <w:tc>
+          <w:tcPr>
+            <w:tcW w:type="dxa" w:w="3000"/>
+            <w:tcBorders>
+              <w:top w:val="single" w:color="1F3864" w:sz="1"/>
+              <w:left w:val="single" w:color="1F3864" w:sz="1"/>
+              <w:bottom w:val="single" w:color="1F3864" w:sz="1"/>
+              <w:right w:val="single" w:color="1F3864" w:sz="1"/>
+            </w:tcBorders>
+            <w:shd w:fill="1F3864" w:color="auto" w:val="clear"/>
+            <w:tcMar>
+              <w:top w:type="dxa" w:w="60"/>
+              <w:left w:type="dxa" w:w="110"/>
+              <w:bottom w:type="dxa" w:w="60"/>
+              <w:right w:type="dxa" w:w="110"/>
+            </w:tcMar>
+            <w:vAlign w:val="center"/>
+          </w:tcPr>
+          <w:p>
+            <w:pPr>
+              <w:spacing w:line="252"/>
+            </w:pPr>
+            <w:r>
+              <w:rPr>
+                <w:rFonts w:ascii="Prompt" w:cs="Prompt" w:eastAsia="Prompt" w:hAnsi="Prompt"/>
+                <w:b/>
+                <w:bCs/>
+                <w:color w:val="FFFFFF"/>
+                <w:sz w:val="18"/>
+                <w:szCs w:val="18"/>
+              </w:rPr>
+              <w:t xml:space="preserve">สถานะ</w:t>
+            </w:r>
+          </w:p>
+        </w:tc>
+      </w:tr>
+      <w:tr>
+        <w:tc>
+          <w:tcPr>
+            <w:tcW w:type="dxa" w:w="1700"/>
+            <w:tcBorders>
+              <w:top w:val="single" w:color="C9D3E0" w:sz="1"/>
+              <w:left w:val="single" w:color="C9D3E0" w:sz="1"/>
+              <w:bottom w:val="single" w:color="C9D3E0" w:sz="1"/>
+              <w:right w:val="single" w:color="C9D3E0" w:sz="1"/>
+            </w:tcBorders>
+            <w:shd w:fill="FFFFFF" w:color="auto" w:val="clear"/>
+            <w:tcMar>
+              <w:top w:type="dxa" w:w="60"/>
+              <w:left w:type="dxa" w:w="110"/>
+              <w:bottom w:type="dxa" w:w="60"/>
+              <w:right w:type="dxa" w:w="110"/>
+            </w:tcMar>
+            <w:vAlign w:val="center"/>
+          </w:tcPr>
+          <w:p>
+            <w:pPr>
+              <w:spacing w:line="252"/>
+            </w:pPr>
+            <w:r>
+              <w:rPr>
+                <w:rFonts w:ascii="Prompt" w:cs="Prompt" w:eastAsia="Prompt" w:hAnsi="Prompt"/>
+                <w:color w:val="1A1A1A"/>
+                <w:sz w:val="17"/>
+                <w:szCs w:val="17"/>
+              </w:rPr>
+              <w:t xml:space="preserve">FR-001/002/019</w:t>
+            </w:r>
+          </w:p>
+        </w:tc>
+        <w:tc>
+          <w:tcPr>
+            <w:tcW w:type="dxa" w:w="4660"/>
+            <w:tcBorders>
+              <w:top w:val="single" w:color="C9D3E0" w:sz="1"/>
+              <w:left w:val="single" w:color="C9D3E0" w:sz="1"/>
+              <w:bottom w:val="single" w:color="C9D3E0" w:sz="1"/>
+              <w:right w:val="single" w:color="C9D3E0" w:sz="1"/>
+            </w:tcBorders>
+            <w:shd w:fill="FFFFFF" w:color="auto" w:val="clear"/>
+            <w:tcMar>
+              <w:top w:type="dxa" w:w="60"/>
+              <w:left w:type="dxa" w:w="110"/>
+              <w:bottom w:type="dxa" w:w="60"/>
+              <w:right w:type="dxa" w:w="110"/>
+            </w:tcMar>
+            <w:vAlign w:val="center"/>
+          </w:tcPr>
+          <w:p>
+            <w:pPr>
+              <w:spacing w:line="252"/>
+            </w:pPr>
+            <w:r>
+              <w:rPr>
+                <w:rFonts w:ascii="Prompt" w:cs="Prompt" w:eastAsia="Prompt" w:hAnsi="Prompt"/>
+                <w:color w:val="1A1A1A"/>
+                <w:sz w:val="17"/>
+                <w:szCs w:val="17"/>
+              </w:rPr>
+              <w:t xml:space="preserve">SO State Machine · สร้าง SO · แม่-ลูก</w:t>
+            </w:r>
+          </w:p>
+        </w:tc>
+        <w:tc>
+          <w:tcPr>
+            <w:tcW w:type="dxa" w:w="3000"/>
+            <w:tcBorders>
+              <w:top w:val="single" w:color="C9D3E0" w:sz="1"/>
+              <w:left w:val="single" w:color="C9D3E0" w:sz="1"/>
+              <w:bottom w:val="single" w:color="C9D3E0" w:sz="1"/>
+              <w:right w:val="single" w:color="C9D3E0" w:sz="1"/>
+            </w:tcBorders>
+            <w:shd w:fill="FFFFFF" w:color="auto" w:val="clear"/>
+            <w:tcMar>
+              <w:top w:type="dxa" w:w="60"/>
+              <w:left w:type="dxa" w:w="110"/>
+              <w:bottom w:type="dxa" w:w="60"/>
+              <w:right w:type="dxa" w:w="110"/>
+            </w:tcMar>
+            <w:vAlign w:val="center"/>
+          </w:tcPr>
+          <w:p>
+            <w:pPr>
+              <w:spacing w:line="252"/>
+            </w:pPr>
+            <w:r>
+              <w:rPr>
+                <w:rFonts w:ascii="Prompt" w:cs="Prompt" w:eastAsia="Prompt" w:hAnsi="Prompt"/>
+                <w:color w:val="1A1A1A"/>
+                <w:sz w:val="17"/>
+                <w:szCs w:val="17"/>
+              </w:rPr>
+              <w:t xml:space="preserve">✓</w:t>
+            </w:r>
+          </w:p>
+        </w:tc>
+      </w:tr>
+      <w:tr>
+        <w:tc>
+          <w:tcPr>
+            <w:tcW w:type="dxa" w:w="1700"/>
+            <w:tcBorders>
+              <w:top w:val="single" w:color="C9D3E0" w:sz="1"/>
+              <w:left w:val="single" w:color="C9D3E0" w:sz="1"/>
+              <w:bottom w:val="single" w:color="C9D3E0" w:sz="1"/>
+              <w:right w:val="single" w:color="C9D3E0" w:sz="1"/>
+            </w:tcBorders>
+            <w:shd w:fill="FFFFFF" w:color="auto" w:val="clear"/>
+            <w:tcMar>
+              <w:top w:type="dxa" w:w="60"/>
+              <w:left w:type="dxa" w:w="110"/>
+              <w:bottom w:type="dxa" w:w="60"/>
+              <w:right w:type="dxa" w:w="110"/>
+            </w:tcMar>
+            <w:vAlign w:val="center"/>
+          </w:tcPr>
+          <w:p>
+            <w:pPr>
+              <w:spacing w:line="252"/>
+            </w:pPr>
+            <w:r>
+              <w:rPr>
+                <w:rFonts w:ascii="Prompt" w:cs="Prompt" w:eastAsia="Prompt" w:hAnsi="Prompt"/>
+                <w:color w:val="1A1A1A"/>
+                <w:sz w:val="17"/>
+                <w:szCs w:val="17"/>
+              </w:rPr>
+              <w:t xml:space="preserve">FR-004/012/013</w:t>
+            </w:r>
+          </w:p>
+        </w:tc>
+        <w:tc>
+          <w:tcPr>
+            <w:tcW w:type="dxa" w:w="4660"/>
+            <w:tcBorders>
+              <w:top w:val="single" w:color="C9D3E0" w:sz="1"/>
+              <w:left w:val="single" w:color="C9D3E0" w:sz="1"/>
+              <w:bottom w:val="single" w:color="C9D3E0" w:sz="1"/>
+              <w:right w:val="single" w:color="C9D3E0" w:sz="1"/>
+            </w:tcBorders>
+            <w:shd w:fill="FFFFFF" w:color="auto" w:val="clear"/>
+            <w:tcMar>
+              <w:top w:type="dxa" w:w="60"/>
+              <w:left w:type="dxa" w:w="110"/>
+              <w:bottom w:type="dxa" w:w="60"/>
+              <w:right w:type="dxa" w:w="110"/>
+            </w:tcMar>
+            <w:vAlign w:val="center"/>
+          </w:tcPr>
+          <w:p>
+            <w:pPr>
+              <w:spacing w:line="252"/>
+            </w:pPr>
+            <w:r>
+              <w:rPr>
+                <w:rFonts w:ascii="Prompt" w:cs="Prompt" w:eastAsia="Prompt" w:hAnsi="Prompt"/>
+                <w:color w:val="1A1A1A"/>
+                <w:sz w:val="17"/>
+                <w:szCs w:val="17"/>
+              </w:rPr>
+              <w:t xml:space="preserve">เอกสาร 4 สี + QR · scan · Kanban + alert</w:t>
+            </w:r>
+          </w:p>
+        </w:tc>
+        <w:tc>
+          <w:tcPr>
+            <w:tcW w:type="dxa" w:w="3000"/>
+            <w:tcBorders>
+              <w:top w:val="single" w:color="C9D3E0" w:sz="1"/>
+              <w:left w:val="single" w:color="C9D3E0" w:sz="1"/>
+              <w:bottom w:val="single" w:color="C9D3E0" w:sz="1"/>
+              <w:right w:val="single" w:color="C9D3E0" w:sz="1"/>
+            </w:tcBorders>
+            <w:shd w:fill="FFFFFF" w:color="auto" w:val="clear"/>
+            <w:tcMar>
+              <w:top w:type="dxa" w:w="60"/>
+              <w:left w:type="dxa" w:w="110"/>
+              <w:bottom w:type="dxa" w:w="60"/>
+              <w:right w:type="dxa" w:w="110"/>
+            </w:tcMar>
+            <w:vAlign w:val="center"/>
+          </w:tcPr>
+          <w:p>
+            <w:pPr>
+              <w:spacing w:line="252"/>
+            </w:pPr>
+            <w:r>
+              <w:rPr>
+                <w:rFonts w:ascii="Prompt" w:cs="Prompt" w:eastAsia="Prompt" w:hAnsi="Prompt"/>
+                <w:color w:val="1A1A1A"/>
+                <w:sz w:val="17"/>
+                <w:szCs w:val="17"/>
+              </w:rPr>
+              <w:t xml:space="preserve">✓</w:t>
+            </w:r>
+          </w:p>
+        </w:tc>
+      </w:tr>
+      <w:tr>
+        <w:tc>
+          <w:tcPr>
+            <w:tcW w:type="dxa" w:w="1700"/>
+            <w:tcBorders>
+              <w:top w:val="single" w:color="C9D3E0" w:sz="1"/>
+              <w:left w:val="single" w:color="C9D3E0" w:sz="1"/>
+              <w:bottom w:val="single" w:color="C9D3E0" w:sz="1"/>
+              <w:right w:val="single" w:color="C9D3E0" w:sz="1"/>
+            </w:tcBorders>
+            <w:shd w:fill="FFFFFF" w:color="auto" w:val="clear"/>
+            <w:tcMar>
+              <w:top w:type="dxa" w:w="60"/>
+              <w:left w:type="dxa" w:w="110"/>
+              <w:bottom w:type="dxa" w:w="60"/>
+              <w:right w:type="dxa" w:w="110"/>
+            </w:tcMar>
+            <w:vAlign w:val="center"/>
+          </w:tcPr>
+          <w:p>
+            <w:pPr>
+              <w:spacing w:line="252"/>
+            </w:pPr>
+            <w:r>
+              <w:rPr>
+                <w:rFonts w:ascii="Prompt" w:cs="Prompt" w:eastAsia="Prompt" w:hAnsi="Prompt"/>
+                <w:color w:val="1A1A1A"/>
+                <w:sz w:val="17"/>
+                <w:szCs w:val="17"/>
+              </w:rPr>
+              <w:t xml:space="preserve">FR-006/007</w:t>
+            </w:r>
+          </w:p>
+        </w:tc>
+        <w:tc>
+          <w:tcPr>
+            <w:tcW w:type="dxa" w:w="4660"/>
+            <w:tcBorders>
+              <w:top w:val="single" w:color="C9D3E0" w:sz="1"/>
+              <w:left w:val="single" w:color="C9D3E0" w:sz="1"/>
+              <w:bottom w:val="single" w:color="C9D3E0" w:sz="1"/>
+              <w:right w:val="single" w:color="C9D3E0" w:sz="1"/>
+            </w:tcBorders>
+            <w:shd w:fill="FFFFFF" w:color="auto" w:val="clear"/>
+            <w:tcMar>
+              <w:top w:type="dxa" w:w="60"/>
+              <w:left w:type="dxa" w:w="110"/>
+              <w:bottom w:type="dxa" w:w="60"/>
+              <w:right w:type="dxa" w:w="110"/>
+            </w:tcMar>
+            <w:vAlign w:val="center"/>
+          </w:tcPr>
+          <w:p>
+            <w:pPr>
+              <w:spacing w:line="252"/>
+            </w:pPr>
+            <w:r>
+              <w:rPr>
+                <w:rFonts w:ascii="Prompt" w:cs="Prompt" w:eastAsia="Prompt" w:hAnsi="Prompt"/>
+                <w:color w:val="1A1A1A"/>
+                <w:sz w:val="17"/>
+                <w:szCs w:val="17"/>
+              </w:rPr>
+              <w:t xml:space="preserve">Unlock Request + อนุมัติ (reverse accrual)</w:t>
+            </w:r>
+          </w:p>
+        </w:tc>
+        <w:tc>
+          <w:tcPr>
+            <w:tcW w:type="dxa" w:w="3000"/>
+            <w:tcBorders>
+              <w:top w:val="single" w:color="C9D3E0" w:sz="1"/>
+              <w:left w:val="single" w:color="C9D3E0" w:sz="1"/>
+              <w:bottom w:val="single" w:color="C9D3E0" w:sz="1"/>
+              <w:right w:val="single" w:color="C9D3E0" w:sz="1"/>
+            </w:tcBorders>
+            <w:shd w:fill="FFFFFF" w:color="auto" w:val="clear"/>
+            <w:tcMar>
+              <w:top w:type="dxa" w:w="60"/>
+              <w:left w:type="dxa" w:w="110"/>
+              <w:bottom w:type="dxa" w:w="60"/>
+              <w:right w:type="dxa" w:w="110"/>
+            </w:tcMar>
+            <w:vAlign w:val="center"/>
+          </w:tcPr>
+          <w:p>
+            <w:pPr>
+              <w:spacing w:line="252"/>
+            </w:pPr>
+            <w:r>
+              <w:rPr>
+                <w:rFonts w:ascii="Prompt" w:cs="Prompt" w:eastAsia="Prompt" w:hAnsi="Prompt"/>
+                <w:color w:val="1A1A1A"/>
+                <w:sz w:val="17"/>
+                <w:szCs w:val="17"/>
+              </w:rPr>
+              <w:t xml:space="preserve">✓</w:t>
+            </w:r>
+          </w:p>
+        </w:tc>
+      </w:tr>
+      <w:tr>
+        <w:tc>
+          <w:tcPr>
+            <w:tcW w:type="dxa" w:w="1700"/>
+            <w:tcBorders>
+              <w:top w:val="single" w:color="C9D3E0" w:sz="1"/>
+              <w:left w:val="single" w:color="C9D3E0" w:sz="1"/>
+              <w:bottom w:val="single" w:color="C9D3E0" w:sz="1"/>
+              <w:right w:val="single" w:color="C9D3E0" w:sz="1"/>
+            </w:tcBorders>
+            <w:shd w:fill="FFFFFF" w:color="auto" w:val="clear"/>
+            <w:tcMar>
+              <w:top w:type="dxa" w:w="60"/>
+              <w:left w:type="dxa" w:w="110"/>
+              <w:bottom w:type="dxa" w:w="60"/>
+              <w:right w:type="dxa" w:w="110"/>
+            </w:tcMar>
+            <w:vAlign w:val="center"/>
+          </w:tcPr>
+          <w:p>
+            <w:pPr>
+              <w:spacing w:line="252"/>
+            </w:pPr>
+            <w:r>
+              <w:rPr>
+                <w:rFonts w:ascii="Prompt" w:cs="Prompt" w:eastAsia="Prompt" w:hAnsi="Prompt"/>
+                <w:color w:val="1A1A1A"/>
+                <w:sz w:val="17"/>
+                <w:szCs w:val="17"/>
+              </w:rPr>
+              <w:t xml:space="preserve">FR-008/009</w:t>
+            </w:r>
+          </w:p>
+        </w:tc>
+        <w:tc>
+          <w:tcPr>
+            <w:tcW w:type="dxa" w:w="4660"/>
+            <w:tcBorders>
+              <w:top w:val="single" w:color="C9D3E0" w:sz="1"/>
+              <w:left w:val="single" w:color="C9D3E0" w:sz="1"/>
+              <w:bottom w:val="single" w:color="C9D3E0" w:sz="1"/>
+              <w:right w:val="single" w:color="C9D3E0" w:sz="1"/>
+            </w:tcBorders>
+            <w:shd w:fill="FFFFFF" w:color="auto" w:val="clear"/>
+            <w:tcMar>
+              <w:top w:type="dxa" w:w="60"/>
+              <w:left w:type="dxa" w:w="110"/>
+              <w:bottom w:type="dxa" w:w="60"/>
+              <w:right w:type="dxa" w:w="110"/>
+            </w:tcMar>
+            <w:vAlign w:val="center"/>
+          </w:tcPr>
+          <w:p>
+            <w:pPr>
+              <w:spacing w:line="252"/>
+            </w:pPr>
+            <w:r>
+              <w:rPr>
+                <w:rFonts w:ascii="Prompt" w:cs="Prompt" w:eastAsia="Prompt" w:hAnsi="Prompt"/>
+                <w:color w:val="1A1A1A"/>
+                <w:sz w:val="17"/>
+                <w:szCs w:val="17"/>
+              </w:rPr>
+              <w:t xml:space="preserve">Rebate Plan + จัดสรร Pool</w:t>
+            </w:r>
+          </w:p>
+        </w:tc>
+        <w:tc>
+          <w:tcPr>
+            <w:tcW w:type="dxa" w:w="3000"/>
+            <w:tcBorders>
+              <w:top w:val="single" w:color="C9D3E0" w:sz="1"/>
+              <w:left w:val="single" w:color="C9D3E0" w:sz="1"/>
+              <w:bottom w:val="single" w:color="C9D3E0" w:sz="1"/>
+              <w:right w:val="single" w:color="C9D3E0" w:sz="1"/>
+            </w:tcBorders>
+            <w:shd w:fill="FFFFFF" w:color="auto" w:val="clear"/>
+            <w:tcMar>
+              <w:top w:type="dxa" w:w="60"/>
+              <w:left w:type="dxa" w:w="110"/>
+              <w:bottom w:type="dxa" w:w="60"/>
+              <w:right w:type="dxa" w:w="110"/>
+            </w:tcMar>
+            <w:vAlign w:val="center"/>
+          </w:tcPr>
+          <w:p>
+            <w:pPr>
+              <w:spacing w:line="252"/>
+            </w:pPr>
+            <w:r>
+              <w:rPr>
+                <w:rFonts w:ascii="Prompt" w:cs="Prompt" w:eastAsia="Prompt" w:hAnsi="Prompt"/>
+                <w:color w:val="1A1A1A"/>
+                <w:sz w:val="17"/>
+                <w:szCs w:val="17"/>
+              </w:rPr>
+              <w:t xml:space="preserve">✓</w:t>
+            </w:r>
+          </w:p>
+        </w:tc>
+      </w:tr>
+      <w:tr>
+        <w:tc>
+          <w:tcPr>
+            <w:tcW w:type="dxa" w:w="1700"/>
+            <w:tcBorders>
+              <w:top w:val="single" w:color="C9D3E0" w:sz="1"/>
+              <w:left w:val="single" w:color="C9D3E0" w:sz="1"/>
+              <w:bottom w:val="single" w:color="C9D3E0" w:sz="1"/>
+              <w:right w:val="single" w:color="C9D3E0" w:sz="1"/>
+            </w:tcBorders>
+            <w:shd w:fill="FFFFFF" w:color="auto" w:val="clear"/>
+            <w:tcMar>
+              <w:top w:type="dxa" w:w="60"/>
+              <w:left w:type="dxa" w:w="110"/>
+              <w:bottom w:type="dxa" w:w="60"/>
+              <w:right w:type="dxa" w:w="110"/>
+            </w:tcMar>
+            <w:vAlign w:val="center"/>
+          </w:tcPr>
+          <w:p>
+            <w:pPr>
+              <w:spacing w:line="252"/>
+            </w:pPr>
+            <w:r>
+              <w:rPr>
+                <w:rFonts w:ascii="Prompt" w:cs="Prompt" w:eastAsia="Prompt" w:hAnsi="Prompt"/>
+                <w:color w:val="1A1A1A"/>
+                <w:sz w:val="17"/>
+                <w:szCs w:val="17"/>
+              </w:rPr>
+              <w:t xml:space="preserve">FR-010/011</w:t>
+            </w:r>
+          </w:p>
+        </w:tc>
+        <w:tc>
+          <w:tcPr>
+            <w:tcW w:type="dxa" w:w="4660"/>
+            <w:tcBorders>
+              <w:top w:val="single" w:color="C9D3E0" w:sz="1"/>
+              <w:left w:val="single" w:color="C9D3E0" w:sz="1"/>
+              <w:bottom w:val="single" w:color="C9D3E0" w:sz="1"/>
+              <w:right w:val="single" w:color="C9D3E0" w:sz="1"/>
+            </w:tcBorders>
+            <w:shd w:fill="FFFFFF" w:color="auto" w:val="clear"/>
+            <w:tcMar>
+              <w:top w:type="dxa" w:w="60"/>
+              <w:left w:type="dxa" w:w="110"/>
+              <w:bottom w:type="dxa" w:w="60"/>
+              <w:right w:type="dxa" w:w="110"/>
+            </w:tcMar>
+            <w:vAlign w:val="center"/>
+          </w:tcPr>
+          <w:p>
+            <w:pPr>
+              <w:spacing w:line="252"/>
+            </w:pPr>
+            <w:r>
+              <w:rPr>
+                <w:rFonts w:ascii="Prompt" w:cs="Prompt" w:eastAsia="Prompt" w:hAnsi="Prompt"/>
+                <w:color w:val="1A1A1A"/>
+                <w:sz w:val="17"/>
+                <w:szCs w:val="17"/>
+              </w:rPr>
+              <w:t xml:space="preserve">Rebate accrual FIFO + Claim → CN</w:t>
+            </w:r>
+          </w:p>
+        </w:tc>
+        <w:tc>
+          <w:tcPr>
+            <w:tcW w:type="dxa" w:w="3000"/>
+            <w:tcBorders>
+              <w:top w:val="single" w:color="C9D3E0" w:sz="1"/>
+              <w:left w:val="single" w:color="C9D3E0" w:sz="1"/>
+              <w:bottom w:val="single" w:color="C9D3E0" w:sz="1"/>
+              <w:right w:val="single" w:color="C9D3E0" w:sz="1"/>
+            </w:tcBorders>
+            <w:shd w:fill="FFFFFF" w:color="auto" w:val="clear"/>
+            <w:tcMar>
+              <w:top w:type="dxa" w:w="60"/>
+              <w:left w:type="dxa" w:w="110"/>
+              <w:bottom w:type="dxa" w:w="60"/>
+              <w:right w:type="dxa" w:w="110"/>
+            </w:tcMar>
+            <w:vAlign w:val="center"/>
+          </w:tcPr>
+          <w:p>
+            <w:pPr>
+              <w:spacing w:line="252"/>
+            </w:pPr>
+            <w:r>
+              <w:rPr>
+                <w:rFonts w:ascii="Prompt" w:cs="Prompt" w:eastAsia="Prompt" w:hAnsi="Prompt"/>
+                <w:color w:val="1A1A1A"/>
+                <w:sz w:val="17"/>
+                <w:szCs w:val="17"/>
+              </w:rPr>
+              <w:t xml:space="preserve">✓</w:t>
+            </w:r>
+          </w:p>
+        </w:tc>
+      </w:tr>
+      <w:tr>
+        <w:tc>
+          <w:tcPr>
+            <w:tcW w:type="dxa" w:w="1700"/>
+            <w:tcBorders>
+              <w:top w:val="single" w:color="C9D3E0" w:sz="1"/>
+              <w:left w:val="single" w:color="C9D3E0" w:sz="1"/>
+              <w:bottom w:val="single" w:color="C9D3E0" w:sz="1"/>
+              <w:right w:val="single" w:color="C9D3E0" w:sz="1"/>
+            </w:tcBorders>
+            <w:shd w:fill="FFFFFF" w:color="auto" w:val="clear"/>
+            <w:tcMar>
+              <w:top w:type="dxa" w:w="60"/>
+              <w:left w:type="dxa" w:w="110"/>
+              <w:bottom w:type="dxa" w:w="60"/>
+              <w:right w:type="dxa" w:w="110"/>
+            </w:tcMar>
+            <w:vAlign w:val="center"/>
+          </w:tcPr>
+          <w:p>
+            <w:pPr>
+              <w:spacing w:line="252"/>
+            </w:pPr>
+            <w:r>
+              <w:rPr>
+                <w:rFonts w:ascii="Prompt" w:cs="Prompt" w:eastAsia="Prompt" w:hAnsi="Prompt"/>
+                <w:color w:val="1A1A1A"/>
+                <w:sz w:val="17"/>
+                <w:szCs w:val="17"/>
+              </w:rPr>
+              <w:t xml:space="preserve">FR-020/021</w:t>
+            </w:r>
+          </w:p>
+        </w:tc>
+        <w:tc>
+          <w:tcPr>
+            <w:tcW w:type="dxa" w:w="4660"/>
+            <w:tcBorders>
+              <w:top w:val="single" w:color="C9D3E0" w:sz="1"/>
+              <w:left w:val="single" w:color="C9D3E0" w:sz="1"/>
+              <w:bottom w:val="single" w:color="C9D3E0" w:sz="1"/>
+              <w:right w:val="single" w:color="C9D3E0" w:sz="1"/>
+            </w:tcBorders>
+            <w:shd w:fill="FFFFFF" w:color="auto" w:val="clear"/>
+            <w:tcMar>
+              <w:top w:type="dxa" w:w="60"/>
+              <w:left w:type="dxa" w:w="110"/>
+              <w:bottom w:type="dxa" w:w="60"/>
+              <w:right w:type="dxa" w:w="110"/>
+            </w:tcMar>
+            <w:vAlign w:val="center"/>
+          </w:tcPr>
+          <w:p>
+            <w:pPr>
+              <w:spacing w:line="252"/>
+            </w:pPr>
+            <w:r>
+              <w:rPr>
+                <w:rFonts w:ascii="Prompt" w:cs="Prompt" w:eastAsia="Prompt" w:hAnsi="Prompt"/>
+                <w:color w:val="1A1A1A"/>
+                <w:sz w:val="17"/>
+                <w:szCs w:val="17"/>
+              </w:rPr>
+              <w:t xml:space="preserve">ของแถม+งบ · Control Ticket (คงเหลือ+ตัด)</w:t>
+            </w:r>
+          </w:p>
+        </w:tc>
+        <w:tc>
+          <w:tcPr>
+            <w:tcW w:type="dxa" w:w="3000"/>
+            <w:tcBorders>
+              <w:top w:val="single" w:color="C9D3E0" w:sz="1"/>
+              <w:left w:val="single" w:color="C9D3E0" w:sz="1"/>
+              <w:bottom w:val="single" w:color="C9D3E0" w:sz="1"/>
+              <w:right w:val="single" w:color="C9D3E0" w:sz="1"/>
+            </w:tcBorders>
+            <w:shd w:fill="FFFFFF" w:color="auto" w:val="clear"/>
+            <w:tcMar>
+              <w:top w:type="dxa" w:w="60"/>
+              <w:left w:type="dxa" w:w="110"/>
+              <w:bottom w:type="dxa" w:w="60"/>
+              <w:right w:type="dxa" w:w="110"/>
+            </w:tcMar>
+            <w:vAlign w:val="center"/>
+          </w:tcPr>
+          <w:p>
+            <w:pPr>
+              <w:spacing w:line="252"/>
+            </w:pPr>
+            <w:r>
+              <w:rPr>
+                <w:rFonts w:ascii="Prompt" w:cs="Prompt" w:eastAsia="Prompt" w:hAnsi="Prompt"/>
+                <w:color w:val="1A1A1A"/>
+                <w:sz w:val="17"/>
+                <w:szCs w:val="17"/>
+              </w:rPr>
+              <w:t xml:space="preserve">✓</w:t>
+            </w:r>
+          </w:p>
+        </w:tc>
+      </w:tr>
+      <w:tr>
+        <w:tc>
+          <w:tcPr>
+            <w:tcW w:type="dxa" w:w="1700"/>
+            <w:tcBorders>
+              <w:top w:val="single" w:color="C9D3E0" w:sz="1"/>
+              <w:left w:val="single" w:color="C9D3E0" w:sz="1"/>
+              <w:bottom w:val="single" w:color="C9D3E0" w:sz="1"/>
+              <w:right w:val="single" w:color="C9D3E0" w:sz="1"/>
+            </w:tcBorders>
+            <w:shd w:fill="FFFFFF" w:color="auto" w:val="clear"/>
+            <w:tcMar>
+              <w:top w:type="dxa" w:w="60"/>
+              <w:left w:type="dxa" w:w="110"/>
+              <w:bottom w:type="dxa" w:w="60"/>
+              <w:right w:type="dxa" w:w="110"/>
+            </w:tcMar>
+            <w:vAlign w:val="center"/>
+          </w:tcPr>
+          <w:p>
+            <w:pPr>
+              <w:spacing w:line="252"/>
+            </w:pPr>
+            <w:r>
+              <w:rPr>
+                <w:rFonts w:ascii="Prompt" w:cs="Prompt" w:eastAsia="Prompt" w:hAnsi="Prompt"/>
+                <w:color w:val="1A1A1A"/>
+                <w:sz w:val="17"/>
+                <w:szCs w:val="17"/>
+              </w:rPr>
+              <w:t xml:space="preserve">FR-022</w:t>
+            </w:r>
+          </w:p>
+        </w:tc>
+        <w:tc>
+          <w:tcPr>
+            <w:tcW w:type="dxa" w:w="4660"/>
+            <w:tcBorders>
+              <w:top w:val="single" w:color="C9D3E0" w:sz="1"/>
+              <w:left w:val="single" w:color="C9D3E0" w:sz="1"/>
+              <w:bottom w:val="single" w:color="C9D3E0" w:sz="1"/>
+              <w:right w:val="single" w:color="C9D3E0" w:sz="1"/>
+            </w:tcBorders>
+            <w:shd w:fill="FFFFFF" w:color="auto" w:val="clear"/>
+            <w:tcMar>
+              <w:top w:type="dxa" w:w="60"/>
+              <w:left w:type="dxa" w:w="110"/>
+              <w:bottom w:type="dxa" w:w="60"/>
+              <w:right w:type="dxa" w:w="110"/>
+            </w:tcMar>
+            <w:vAlign w:val="center"/>
+          </w:tcPr>
+          <w:p>
+            <w:pPr>
+              <w:spacing w:line="252"/>
+            </w:pPr>
+            <w:r>
+              <w:rPr>
+                <w:rFonts w:ascii="Prompt" w:cs="Prompt" w:eastAsia="Prompt" w:hAnsi="Prompt"/>
+                <w:color w:val="1A1A1A"/>
+                <w:sz w:val="17"/>
+                <w:szCs w:val="17"/>
+              </w:rPr>
+              <w:t xml:space="preserve">Counter-Sales Verification Gate</w:t>
+            </w:r>
+          </w:p>
+        </w:tc>
+        <w:tc>
+          <w:tcPr>
+            <w:tcW w:type="dxa" w:w="3000"/>
+            <w:tcBorders>
+              <w:top w:val="single" w:color="C9D3E0" w:sz="1"/>
+              <w:left w:val="single" w:color="C9D3E0" w:sz="1"/>
+              <w:bottom w:val="single" w:color="C9D3E0" w:sz="1"/>
+              <w:right w:val="single" w:color="C9D3E0" w:sz="1"/>
+            </w:tcBorders>
+            <w:shd w:fill="FFFFFF" w:color="auto" w:val="clear"/>
+            <w:tcMar>
+              <w:top w:type="dxa" w:w="60"/>
+              <w:left w:type="dxa" w:w="110"/>
+              <w:bottom w:type="dxa" w:w="60"/>
+              <w:right w:type="dxa" w:w="110"/>
+            </w:tcMar>
+            <w:vAlign w:val="center"/>
+          </w:tcPr>
+          <w:p>
+            <w:pPr>
+              <w:spacing w:line="252"/>
+            </w:pPr>
+            <w:r>
+              <w:rPr>
+                <w:rFonts w:ascii="Prompt" w:cs="Prompt" w:eastAsia="Prompt" w:hAnsi="Prompt"/>
+                <w:color w:val="1A1A1A"/>
+                <w:sz w:val="17"/>
+                <w:szCs w:val="17"/>
+              </w:rPr>
+              <w:t xml:space="preserve">✓</w:t>
+            </w:r>
+          </w:p>
+        </w:tc>
+      </w:tr>
+      <w:tr>
+        <w:tc>
+          <w:tcPr>
+            <w:tcW w:type="dxa" w:w="1700"/>
+            <w:tcBorders>
+              <w:top w:val="single" w:color="C9D3E0" w:sz="1"/>
+              <w:left w:val="single" w:color="C9D3E0" w:sz="1"/>
+              <w:bottom w:val="single" w:color="C9D3E0" w:sz="1"/>
+              <w:right w:val="single" w:color="C9D3E0" w:sz="1"/>
+            </w:tcBorders>
+            <w:shd w:fill="FFFFFF" w:color="auto" w:val="clear"/>
+            <w:tcMar>
+              <w:top w:type="dxa" w:w="60"/>
+              <w:left w:type="dxa" w:w="110"/>
+              <w:bottom w:type="dxa" w:w="60"/>
+              <w:right w:type="dxa" w:w="110"/>
+            </w:tcMar>
+            <w:vAlign w:val="center"/>
+          </w:tcPr>
+          <w:p>
+            <w:pPr>
+              <w:spacing w:line="252"/>
+            </w:pPr>
+            <w:r>
+              <w:rPr>
+                <w:rFonts w:ascii="Prompt" w:cs="Prompt" w:eastAsia="Prompt" w:hAnsi="Prompt"/>
+                <w:color w:val="1A1A1A"/>
+                <w:sz w:val="17"/>
+                <w:szCs w:val="17"/>
+              </w:rPr>
+              <w:t xml:space="preserve">FR-017</w:t>
+            </w:r>
+          </w:p>
+        </w:tc>
+        <w:tc>
+          <w:tcPr>
+            <w:tcW w:type="dxa" w:w="4660"/>
+            <w:tcBorders>
+              <w:top w:val="single" w:color="C9D3E0" w:sz="1"/>
+              <w:left w:val="single" w:color="C9D3E0" w:sz="1"/>
+              <w:bottom w:val="single" w:color="C9D3E0" w:sz="1"/>
+              <w:right w:val="single" w:color="C9D3E0" w:sz="1"/>
+            </w:tcBorders>
+            <w:shd w:fill="FFFFFF" w:color="auto" w:val="clear"/>
+            <w:tcMar>
+              <w:top w:type="dxa" w:w="60"/>
+              <w:left w:type="dxa" w:w="110"/>
+              <w:bottom w:type="dxa" w:w="60"/>
+              <w:right w:type="dxa" w:w="110"/>
+            </w:tcMar>
+            <w:vAlign w:val="center"/>
+          </w:tcPr>
+          <w:p>
+            <w:pPr>
+              <w:spacing w:line="252"/>
+            </w:pPr>
+            <w:r>
+              <w:rPr>
+                <w:rFonts w:ascii="Prompt" w:cs="Prompt" w:eastAsia="Prompt" w:hAnsi="Prompt"/>
+                <w:color w:val="1A1A1A"/>
+                <w:sz w:val="17"/>
+                <w:szCs w:val="17"/>
+              </w:rPr>
+              <w:t xml:space="preserve">Reports + Dashboard + Export Excel</w:t>
+            </w:r>
+          </w:p>
+        </w:tc>
+        <w:tc>
+          <w:tcPr>
+            <w:tcW w:type="dxa" w:w="3000"/>
+            <w:tcBorders>
+              <w:top w:val="single" w:color="C9D3E0" w:sz="1"/>
+              <w:left w:val="single" w:color="C9D3E0" w:sz="1"/>
+              <w:bottom w:val="single" w:color="C9D3E0" w:sz="1"/>
+              <w:right w:val="single" w:color="C9D3E0" w:sz="1"/>
+            </w:tcBorders>
+            <w:shd w:fill="FFFFFF" w:color="auto" w:val="clear"/>
+            <w:tcMar>
+              <w:top w:type="dxa" w:w="60"/>
+              <w:left w:type="dxa" w:w="110"/>
+              <w:bottom w:type="dxa" w:w="60"/>
+              <w:right w:type="dxa" w:w="110"/>
+            </w:tcMar>
+            <w:vAlign w:val="center"/>
+          </w:tcPr>
+          <w:p>
+            <w:pPr>
+              <w:spacing w:line="252"/>
+            </w:pPr>
+            <w:r>
+              <w:rPr>
+                <w:rFonts w:ascii="Prompt" w:cs="Prompt" w:eastAsia="Prompt" w:hAnsi="Prompt"/>
+                <w:color w:val="1A1A1A"/>
+                <w:sz w:val="17"/>
+                <w:szCs w:val="17"/>
+              </w:rPr>
+              <w:t xml:space="preserve">✓</w:t>
+            </w:r>
+          </w:p>
+        </w:tc>
+      </w:tr>
+      <w:tr>
+        <w:tc>
+          <w:tcPr>
+            <w:tcW w:type="dxa" w:w="1700"/>
+            <w:tcBorders>
+              <w:top w:val="single" w:color="C9D3E0" w:sz="1"/>
+              <w:left w:val="single" w:color="C9D3E0" w:sz="1"/>
+              <w:bottom w:val="single" w:color="C9D3E0" w:sz="1"/>
+              <w:right w:val="single" w:color="C9D3E0" w:sz="1"/>
+            </w:tcBorders>
+            <w:shd w:fill="FFFFFF" w:color="auto" w:val="clear"/>
+            <w:tcMar>
+              <w:top w:type="dxa" w:w="60"/>
+              <w:left w:type="dxa" w:w="110"/>
+              <w:bottom w:type="dxa" w:w="60"/>
+              <w:right w:type="dxa" w:w="110"/>
+            </w:tcMar>
+            <w:vAlign w:val="center"/>
+          </w:tcPr>
+          <w:p>
+            <w:pPr>
+              <w:spacing w:line="252"/>
+            </w:pPr>
+            <w:r>
+              <w:rPr>
+                <w:rFonts w:ascii="Prompt" w:cs="Prompt" w:eastAsia="Prompt" w:hAnsi="Prompt"/>
+                <w:color w:val="1A1A1A"/>
+                <w:sz w:val="17"/>
+                <w:szCs w:val="17"/>
+              </w:rPr>
+              <w:t xml:space="preserve">FR-023</w:t>
+            </w:r>
+          </w:p>
+        </w:tc>
+        <w:tc>
+          <w:tcPr>
+            <w:tcW w:type="dxa" w:w="4660"/>
+            <w:tcBorders>
+              <w:top w:val="single" w:color="C9D3E0" w:sz="1"/>
+              <w:left w:val="single" w:color="C9D3E0" w:sz="1"/>
+              <w:bottom w:val="single" w:color="C9D3E0" w:sz="1"/>
+              <w:right w:val="single" w:color="C9D3E0" w:sz="1"/>
+            </w:tcBorders>
+            <w:shd w:fill="FFFFFF" w:color="auto" w:val="clear"/>
+            <w:tcMar>
+              <w:top w:type="dxa" w:w="60"/>
+              <w:left w:type="dxa" w:w="110"/>
+              <w:bottom w:type="dxa" w:w="60"/>
+              <w:right w:type="dxa" w:w="110"/>
+            </w:tcMar>
+            <w:vAlign w:val="center"/>
+          </w:tcPr>
+          <w:p>
+            <w:pPr>
+              <w:spacing w:line="252"/>
+            </w:pPr>
+            <w:r>
+              <w:rPr>
+                <w:rFonts w:ascii="Prompt" w:cs="Prompt" w:eastAsia="Prompt" w:hAnsi="Prompt"/>
+                <w:color w:val="1A1A1A"/>
+                <w:sz w:val="17"/>
+                <w:szCs w:val="17"/>
+              </w:rPr>
+              <w:t xml:space="preserve">Price Book NET รายเดือน (EMSetPriceDT)</w:t>
+            </w:r>
+          </w:p>
+        </w:tc>
+        <w:tc>
+          <w:tcPr>
+            <w:tcW w:type="dxa" w:w="3000"/>
+            <w:tcBorders>
+              <w:top w:val="single" w:color="C9D3E0" w:sz="1"/>
+              <w:left w:val="single" w:color="C9D3E0" w:sz="1"/>
+              <w:bottom w:val="single" w:color="C9D3E0" w:sz="1"/>
+              <w:right w:val="single" w:color="C9D3E0" w:sz="1"/>
+            </w:tcBorders>
+            <w:shd w:fill="FFFFFF" w:color="auto" w:val="clear"/>
+            <w:tcMar>
+              <w:top w:type="dxa" w:w="60"/>
+              <w:left w:type="dxa" w:w="110"/>
+              <w:bottom w:type="dxa" w:w="60"/>
+              <w:right w:type="dxa" w:w="110"/>
+            </w:tcMar>
+            <w:vAlign w:val="center"/>
+          </w:tcPr>
+          <w:p>
+            <w:pPr>
+              <w:spacing w:line="252"/>
+            </w:pPr>
+            <w:r>
+              <w:rPr>
+                <w:rFonts w:ascii="Prompt" w:cs="Prompt" w:eastAsia="Prompt" w:hAnsi="Prompt"/>
+                <w:color w:val="1A1A1A"/>
+                <w:sz w:val="17"/>
+                <w:szCs w:val="17"/>
+              </w:rPr>
+              <w:t xml:space="preserve">✓</w:t>
+            </w:r>
+          </w:p>
+        </w:tc>
+      </w:tr>
+      <w:tr>
+        <w:tc>
+          <w:tcPr>
+            <w:tcW w:type="dxa" w:w="1700"/>
+            <w:tcBorders>
+              <w:top w:val="single" w:color="C9D3E0" w:sz="1"/>
+              <w:left w:val="single" w:color="C9D3E0" w:sz="1"/>
+              <w:bottom w:val="single" w:color="C9D3E0" w:sz="1"/>
+              <w:right w:val="single" w:color="C9D3E0" w:sz="1"/>
+            </w:tcBorders>
+            <w:shd w:fill="FFFFFF" w:color="auto" w:val="clear"/>
+            <w:tcMar>
+              <w:top w:type="dxa" w:w="60"/>
+              <w:left w:type="dxa" w:w="110"/>
+              <w:bottom w:type="dxa" w:w="60"/>
+              <w:right w:type="dxa" w:w="110"/>
+            </w:tcMar>
+            <w:vAlign w:val="center"/>
+          </w:tcPr>
+          <w:p>
+            <w:pPr>
+              <w:spacing w:line="252"/>
+            </w:pPr>
+            <w:r>
+              <w:rPr>
+                <w:rFonts w:ascii="Prompt" w:cs="Prompt" w:eastAsia="Prompt" w:hAnsi="Prompt"/>
+                <w:color w:val="1A1A1A"/>
+                <w:sz w:val="17"/>
+                <w:szCs w:val="17"/>
+              </w:rPr>
+              <w:t xml:space="preserve">FR-003 / FR-016</w:t>
+            </w:r>
+          </w:p>
+        </w:tc>
+        <w:tc>
+          <w:tcPr>
+            <w:tcW w:type="dxa" w:w="4660"/>
+            <w:tcBorders>
+              <w:top w:val="single" w:color="C9D3E0" w:sz="1"/>
+              <w:left w:val="single" w:color="C9D3E0" w:sz="1"/>
+              <w:bottom w:val="single" w:color="C9D3E0" w:sz="1"/>
+              <w:right w:val="single" w:color="C9D3E0" w:sz="1"/>
+            </w:tcBorders>
+            <w:shd w:fill="FFFFFF" w:color="auto" w:val="clear"/>
+            <w:tcMar>
+              <w:top w:type="dxa" w:w="60"/>
+              <w:left w:type="dxa" w:w="110"/>
+              <w:bottom w:type="dxa" w:w="60"/>
+              <w:right w:type="dxa" w:w="110"/>
+            </w:tcMar>
+            <w:vAlign w:val="center"/>
+          </w:tcPr>
+          <w:p>
+            <w:pPr>
+              <w:spacing w:line="252"/>
+            </w:pPr>
+            <w:r>
+              <w:rPr>
+                <w:rFonts w:ascii="Prompt" w:cs="Prompt" w:eastAsia="Prompt" w:hAnsi="Prompt"/>
+                <w:color w:val="1A1A1A"/>
+                <w:sz w:val="17"/>
+                <w:szCs w:val="17"/>
+              </w:rPr>
+              <w:t xml:space="preserve">Credit Hold / LINE intake</w:t>
+            </w:r>
+          </w:p>
+        </w:tc>
+        <w:tc>
+          <w:tcPr>
+            <w:tcW w:type="dxa" w:w="3000"/>
+            <w:tcBorders>
+              <w:top w:val="single" w:color="C9D3E0" w:sz="1"/>
+              <w:left w:val="single" w:color="C9D3E0" w:sz="1"/>
+              <w:bottom w:val="single" w:color="C9D3E0" w:sz="1"/>
+              <w:right w:val="single" w:color="C9D3E0" w:sz="1"/>
+            </w:tcBorders>
+            <w:shd w:fill="FFFFFF" w:color="auto" w:val="clear"/>
+            <w:tcMar>
+              <w:top w:type="dxa" w:w="60"/>
+              <w:left w:type="dxa" w:w="110"/>
+              <w:bottom w:type="dxa" w:w="60"/>
+              <w:right w:type="dxa" w:w="110"/>
+            </w:tcMar>
+            <w:vAlign w:val="center"/>
+          </w:tcPr>
+          <w:p>
+            <w:pPr>
+              <w:spacing w:line="252"/>
+            </w:pPr>
+            <w:r>
+              <w:rPr>
+                <w:rFonts w:ascii="Prompt" w:cs="Prompt" w:eastAsia="Prompt" w:hAnsi="Prompt"/>
+                <w:color w:val="1A1A1A"/>
+                <w:sz w:val="17"/>
+                <w:szCs w:val="17"/>
+              </w:rPr>
+              <w:t xml:space="preserve">— (รอตัดสินใจ / Phase ถัดไป)</w:t>
+            </w:r>
+          </w:p>
+        </w:tc>
+      </w:tr>
+      <w:tr>
+        <w:tc>
+          <w:tcPr>
+            <w:tcW w:type="dxa" w:w="1700"/>
+            <w:tcBorders>
+              <w:top w:val="single" w:color="C9D3E0" w:sz="1"/>
+              <w:left w:val="single" w:color="C9D3E0" w:sz="1"/>
+              <w:bottom w:val="single" w:color="C9D3E0" w:sz="1"/>
+              <w:right w:val="single" w:color="C9D3E0" w:sz="1"/>
+            </w:tcBorders>
+            <w:shd w:fill="FFFFFF" w:color="auto" w:val="clear"/>
+            <w:tcMar>
+              <w:top w:type="dxa" w:w="60"/>
+              <w:left w:type="dxa" w:w="110"/>
+              <w:bottom w:type="dxa" w:w="60"/>
+              <w:right w:type="dxa" w:w="110"/>
+            </w:tcMar>
+            <w:vAlign w:val="center"/>
+          </w:tcPr>
+          <w:p>
+            <w:pPr>
+              <w:spacing w:line="252"/>
+            </w:pPr>
+            <w:r>
+              <w:rPr>
+                <w:rFonts w:ascii="Prompt" w:cs="Prompt" w:eastAsia="Prompt" w:hAnsi="Prompt"/>
+                <w:color w:val="1A1A1A"/>
+                <w:sz w:val="17"/>
+                <w:szCs w:val="17"/>
+              </w:rPr>
+              <w:t xml:space="preserve">FR-024/025/026</w:t>
+            </w:r>
+          </w:p>
+        </w:tc>
+        <w:tc>
+          <w:tcPr>
+            <w:tcW w:type="dxa" w:w="4660"/>
+            <w:tcBorders>
+              <w:top w:val="single" w:color="C9D3E0" w:sz="1"/>
+              <w:left w:val="single" w:color="C9D3E0" w:sz="1"/>
+              <w:bottom w:val="single" w:color="C9D3E0" w:sz="1"/>
+              <w:right w:val="single" w:color="C9D3E0" w:sz="1"/>
+            </w:tcBorders>
+            <w:shd w:fill="FFFFFF" w:color="auto" w:val="clear"/>
+            <w:tcMar>
+              <w:top w:type="dxa" w:w="60"/>
+              <w:left w:type="dxa" w:w="110"/>
+              <w:bottom w:type="dxa" w:w="60"/>
+              <w:right w:type="dxa" w:w="110"/>
+            </w:tcMar>
+            <w:vAlign w:val="center"/>
+          </w:tcPr>
+          <w:p>
+            <w:pPr>
+              <w:spacing w:line="252"/>
+            </w:pPr>
+            <w:r>
+              <w:rPr>
+                <w:rFonts w:ascii="Prompt" w:cs="Prompt" w:eastAsia="Prompt" w:hAnsi="Prompt"/>
+                <w:color w:val="1A1A1A"/>
+                <w:sz w:val="17"/>
+                <w:szCs w:val="17"/>
+              </w:rPr>
+              <w:t xml:space="preserve">TruckScale Weigh-In/Out live</w:t>
+            </w:r>
+          </w:p>
+        </w:tc>
+        <w:tc>
+          <w:tcPr>
+            <w:tcW w:type="dxa" w:w="3000"/>
+            <w:tcBorders>
+              <w:top w:val="single" w:color="C9D3E0" w:sz="1"/>
+              <w:left w:val="single" w:color="C9D3E0" w:sz="1"/>
+              <w:bottom w:val="single" w:color="C9D3E0" w:sz="1"/>
+              <w:right w:val="single" w:color="C9D3E0" w:sz="1"/>
+            </w:tcBorders>
+            <w:shd w:fill="FFFFFF" w:color="auto" w:val="clear"/>
+            <w:tcMar>
+              <w:top w:type="dxa" w:w="60"/>
+              <w:left w:type="dxa" w:w="110"/>
+              <w:bottom w:type="dxa" w:w="60"/>
+              <w:right w:type="dxa" w:w="110"/>
+            </w:tcMar>
+            <w:vAlign w:val="center"/>
+          </w:tcPr>
+          <w:p>
+            <w:pPr>
+              <w:spacing w:line="252"/>
+            </w:pPr>
+            <w:r>
+              <w:rPr>
+                <w:rFonts w:ascii="Prompt" w:cs="Prompt" w:eastAsia="Prompt" w:hAnsi="Prompt"/>
+                <w:color w:val="1A1A1A"/>
+                <w:sz w:val="17"/>
+                <w:szCs w:val="17"/>
+              </w:rPr>
+              <w:t xml:space="preserve">⏳ รอ VPN (โครงสร้าง WeighTicket พร้อม)</w:t>
+            </w:r>
+          </w:p>
+        </w:tc>
+      </w:tr>
+    </w:tbl>
+    <w:p/>
+    <w:p>
+      <w:pPr>
+        <w:spacing w:after="80" w:line="276"/>
+      </w:pPr>
+      <w:r>
+        <w:rPr>
+          <w:rFonts w:ascii="Prompt" w:cs="Prompt" w:eastAsia="Prompt" w:hAnsi="Prompt"/>
+          <w:color w:val="6B6B6B"/>
+          <w:sz w:val="16"/>
+          <w:szCs w:val="16"/>
+        </w:rPr>
+        <w:t xml:space="preserve">— จบหมวด 17: Implementation Update —</w:t>
+      </w:r>
+    </w:p>
+    <w:p>
       <w:pPr>
         <w:spacing w:before="160"/>
         <w:jc w:val="center"/>
@@ -49246,7 +52453,7 @@
           <w:sz w:val="16"/>
           <w:szCs w:val="16"/>
         </w:rPr>
-        <w:t xml:space="preserve">Software Requirements Specification | World Fert Co., Ltd. | v6.0 (Production — Implemented) | 27 มิ.ย. 2569</w:t>
+        <w:t xml:space="preserve">Software Requirements Specification | World Fert Co., Ltd. | v6.1 (Production — Implemented) | 27 มิ.ย. 2569</w:t>
       </w:r>
     </w:p>
     <w:sectPr>

</xml_diff>

<commit_message>
docs(v6.2): TruckScale DESIGN → LIVE (Railway MySQL, build v4.2.17)
- SRS: §18 TruckScale Live Integration (connection, endpoints, plate-based
  matching, flow) + bump cover/footer v6.2 + revision row 6.2
- pptx: v6.1→v6.2 + TruckScale slides DESIGN→LIVE
- drawio: TruckScale page + implemented page marked LIVE

Co-Authored-By: Claude Opus 4.8 <noreply@anthropic.com>
</commit_message>
<xml_diff>
--- a/refs/WorldFert_SRS_v6_0.docx
+++ b/refs/WorldFert_SRS_v6_0.docx
@@ -382,7 +382,7 @@
                 <w:sz w:val="17"/>
                 <w:szCs w:val="17"/>
               </w:rPr>
-              <w:t xml:space="preserve">6.1 (Production — Implemented &amp; Verified)</w:t>
+              <w:t xml:space="preserve">6.2 (Production — Implemented &amp; Verified)</w:t>
             </w:r>
           </w:p>
         </w:tc>
@@ -2059,6 +2059,140 @@
                 <w:szCs w:val="17"/>
               </w:rPr>
               <w:t xml:space="preserve">Implementation update (build v4.2.16): implement ฟีเจอร์ที่ออกแบบไว้จนครบ — Paper Trail 4 สี+QR+scan · Rebate Plan+allocation · Verification Gate · Unlock Request · WeighTicket (gross/tare/net) · Control Ticket page · Reports+Excel · ยืนยันแนวทาง dbo write ตรง (ดู §17.3)</w:t>
+            </w:r>
+          </w:p>
+        </w:tc>
+      </w:tr>
+      <w:tr>
+        <w:tc>
+          <w:tcPr>
+            <w:tcW w:type="dxa" w:w="1000"/>
+            <w:tcBorders>
+              <w:top w:val="single" w:color="C9D3E0" w:sz="1"/>
+              <w:left w:val="single" w:color="C9D3E0" w:sz="1"/>
+              <w:bottom w:val="single" w:color="C9D3E0" w:sz="1"/>
+              <w:right w:val="single" w:color="C9D3E0" w:sz="1"/>
+            </w:tcBorders>
+            <w:shd w:fill="EBF0F7" w:color="auto" w:val="clear"/>
+            <w:tcMar>
+              <w:top w:type="dxa" w:w="60"/>
+              <w:left w:type="dxa" w:w="110"/>
+              <w:bottom w:type="dxa" w:w="60"/>
+              <w:right w:type="dxa" w:w="110"/>
+            </w:tcMar>
+            <w:vAlign w:val="center"/>
+          </w:tcPr>
+          <w:p>
+            <w:pPr>
+              <w:spacing w:line="252"/>
+            </w:pPr>
+            <w:r>
+              <w:rPr>
+                <w:rFonts w:ascii="Prompt" w:cs="Prompt" w:eastAsia="Prompt" w:hAnsi="Prompt"/>
+                <w:color w:val="1A1A1A"/>
+                <w:sz w:val="17"/>
+                <w:szCs w:val="17"/>
+              </w:rPr>
+              <w:t xml:space="preserve">6.2</w:t>
+            </w:r>
+          </w:p>
+        </w:tc>
+        <w:tc>
+          <w:tcPr>
+            <w:tcW w:type="dxa" w:w="1400"/>
+            <w:tcBorders>
+              <w:top w:val="single" w:color="C9D3E0" w:sz="1"/>
+              <w:left w:val="single" w:color="C9D3E0" w:sz="1"/>
+              <w:bottom w:val="single" w:color="C9D3E0" w:sz="1"/>
+              <w:right w:val="single" w:color="C9D3E0" w:sz="1"/>
+            </w:tcBorders>
+            <w:shd w:fill="EBF0F7" w:color="auto" w:val="clear"/>
+            <w:tcMar>
+              <w:top w:type="dxa" w:w="60"/>
+              <w:left w:type="dxa" w:w="110"/>
+              <w:bottom w:type="dxa" w:w="60"/>
+              <w:right w:type="dxa" w:w="110"/>
+            </w:tcMar>
+            <w:vAlign w:val="center"/>
+          </w:tcPr>
+          <w:p>
+            <w:pPr>
+              <w:spacing w:line="252"/>
+            </w:pPr>
+            <w:r>
+              <w:rPr>
+                <w:rFonts w:ascii="Prompt" w:cs="Prompt" w:eastAsia="Prompt" w:hAnsi="Prompt"/>
+                <w:color w:val="1A1A1A"/>
+                <w:sz w:val="17"/>
+                <w:szCs w:val="17"/>
+              </w:rPr>
+              <w:t xml:space="preserve">27/06/2569</w:t>
+            </w:r>
+          </w:p>
+        </w:tc>
+        <w:tc>
+          <w:tcPr>
+            <w:tcW w:type="dxa" w:w="1700"/>
+            <w:tcBorders>
+              <w:top w:val="single" w:color="C9D3E0" w:sz="1"/>
+              <w:left w:val="single" w:color="C9D3E0" w:sz="1"/>
+              <w:bottom w:val="single" w:color="C9D3E0" w:sz="1"/>
+              <w:right w:val="single" w:color="C9D3E0" w:sz="1"/>
+            </w:tcBorders>
+            <w:shd w:fill="EBF0F7" w:color="auto" w:val="clear"/>
+            <w:tcMar>
+              <w:top w:type="dxa" w:w="60"/>
+              <w:left w:type="dxa" w:w="110"/>
+              <w:bottom w:type="dxa" w:w="60"/>
+              <w:right w:type="dxa" w:w="110"/>
+            </w:tcMar>
+            <w:vAlign w:val="center"/>
+          </w:tcPr>
+          <w:p>
+            <w:pPr>
+              <w:spacing w:line="252"/>
+            </w:pPr>
+            <w:r>
+              <w:rPr>
+                <w:rFonts w:ascii="Prompt" w:cs="Prompt" w:eastAsia="Prompt" w:hAnsi="Prompt"/>
+                <w:color w:val="1A1A1A"/>
+                <w:sz w:val="17"/>
+                <w:szCs w:val="17"/>
+              </w:rPr>
+              <w:t xml:space="preserve">T. Meeriksom</w:t>
+            </w:r>
+          </w:p>
+        </w:tc>
+        <w:tc>
+          <w:tcPr>
+            <w:tcW w:type="dxa" w:w="5260"/>
+            <w:tcBorders>
+              <w:top w:val="single" w:color="C9D3E0" w:sz="1"/>
+              <w:left w:val="single" w:color="C9D3E0" w:sz="1"/>
+              <w:bottom w:val="single" w:color="C9D3E0" w:sz="1"/>
+              <w:right w:val="single" w:color="C9D3E0" w:sz="1"/>
+            </w:tcBorders>
+            <w:shd w:fill="EBF0F7" w:color="auto" w:val="clear"/>
+            <w:tcMar>
+              <w:top w:type="dxa" w:w="60"/>
+              <w:left w:type="dxa" w:w="110"/>
+              <w:bottom w:type="dxa" w:w="60"/>
+              <w:right w:type="dxa" w:w="110"/>
+            </w:tcMar>
+            <w:vAlign w:val="center"/>
+          </w:tcPr>
+          <w:p>
+            <w:pPr>
+              <w:spacing w:line="252"/>
+            </w:pPr>
+            <w:r>
+              <w:rPr>
+                <w:rFonts w:ascii="Prompt" w:cs="Prompt" w:eastAsia="Prompt" w:hAnsi="Prompt"/>
+                <w:color w:val="1A1A1A"/>
+                <w:sz w:val="17"/>
+                <w:szCs w:val="17"/>
+              </w:rPr>
+              <w:t xml:space="preserve">TruckScale LIVE (build v4.2.17): ย้ายข้อมูล TruckScale ขึ้น Railway MySQL (cloud) — ไม่ต้อง VPN · เชื่อม mysql2 pool แยก · /api/truckscale/* (ping/weigh/scale/for-so) · match ด้วยทะเบียนรถ · ดึงน้ำหนักจริงกรอก WeighTicket ตอน ship · §16 = Implemented</w:t>
             </w:r>
           </w:p>
         </w:tc>
@@ -52425,6 +52559,886 @@
       </w:r>
     </w:p>
     <w:p>
+      <w:r>
+        <w:br w:type="page"/>
+      </w:r>
+    </w:p>
+    <w:p>
+      <w:pPr>
+        <w:pStyle w:val="Heading1"/>
+        <w:spacing w:after="160" w:before="320"/>
+      </w:pPr>
+      <w:r>
+        <w:rPr>
+          <w:rFonts w:ascii="Prompt" w:cs="Prompt" w:eastAsia="Prompt" w:hAnsi="Prompt"/>
+          <w:b/>
+          <w:bCs/>
+          <w:color w:val="1F3864"/>
+          <w:sz w:val="30"/>
+          <w:szCs w:val="30"/>
+        </w:rPr>
+        <w:t xml:space="preserve">18. TruckScale — Live Integration (Implemented · build v4.2.17)</w:t>
+      </w:r>
+    </w:p>
+    <w:p>
+      <w:pPr>
+        <w:spacing w:after="80" w:line="276"/>
+      </w:pPr>
+      <w:r>
+        <w:rPr>
+          <w:rFonts w:ascii="Prompt" w:cs="Prompt" w:eastAsia="Prompt" w:hAnsi="Prompt"/>
+          <w:b/>
+          <w:bCs/>
+          <w:color w:val="3B6D11"/>
+          <w:sz w:val="18"/>
+          <w:szCs w:val="18"/>
+        </w:rPr>
+        <w:t xml:space="preserve">สถานะ: LIVE — §16 (Design) ถูก implement จริงแล้ว · ข้อมูล TruckScale ถูกย้ายขึ้น Railway MySQL (cloud) จึงเชื่อมได้โดยไม่ต้อง VPN เข้า 192.168.1.253</w:t>
+      </w:r>
+    </w:p>
+    <w:p>
+      <w:pPr>
+        <w:pStyle w:val="Heading2"/>
+        <w:spacing w:after="120" w:before="240"/>
+      </w:pPr>
+      <w:r>
+        <w:rPr>
+          <w:rFonts w:ascii="Prompt" w:cs="Prompt" w:eastAsia="Prompt" w:hAnsi="Prompt"/>
+          <w:b/>
+          <w:bCs/>
+          <w:color w:val="1F3864"/>
+          <w:sz w:val="24"/>
+          <w:szCs w:val="24"/>
+        </w:rPr>
+        <w:t xml:space="preserve">18.1 การเชื่อมต่อ</w:t>
+      </w:r>
+    </w:p>
+    <w:tbl>
+      <w:tblPr>
+        <w:tblW w:type="dxa" w:w="9360"/>
+        <w:tblBorders>
+          <w:top w:val="single" w:color="auto" w:sz="4"/>
+          <w:left w:val="single" w:color="auto" w:sz="4"/>
+          <w:bottom w:val="single" w:color="auto" w:sz="4"/>
+          <w:right w:val="single" w:color="auto" w:sz="4"/>
+          <w:insideH w:val="single" w:color="auto" w:sz="4"/>
+          <w:insideV w:val="single" w:color="auto" w:sz="4"/>
+        </w:tblBorders>
+      </w:tblPr>
+      <w:tblGrid>
+        <w:gridCol w:w="2200"/>
+        <w:gridCol w:w="7160"/>
+      </w:tblGrid>
+      <w:tr>
+        <w:trPr>
+          <w:tblHeader/>
+        </w:trPr>
+        <w:tc>
+          <w:tcPr>
+            <w:tcW w:type="dxa" w:w="2200"/>
+            <w:tcBorders>
+              <w:top w:val="single" w:color="1F3864" w:sz="1"/>
+              <w:left w:val="single" w:color="1F3864" w:sz="1"/>
+              <w:bottom w:val="single" w:color="1F3864" w:sz="1"/>
+              <w:right w:val="single" w:color="1F3864" w:sz="1"/>
+            </w:tcBorders>
+            <w:shd w:fill="1F3864" w:color="auto" w:val="clear"/>
+            <w:tcMar>
+              <w:top w:type="dxa" w:w="60"/>
+              <w:left w:type="dxa" w:w="110"/>
+              <w:bottom w:type="dxa" w:w="60"/>
+              <w:right w:type="dxa" w:w="110"/>
+            </w:tcMar>
+            <w:vAlign w:val="center"/>
+          </w:tcPr>
+          <w:p>
+            <w:pPr>
+              <w:spacing w:line="252"/>
+            </w:pPr>
+            <w:r>
+              <w:rPr>
+                <w:rFonts w:ascii="Prompt" w:cs="Prompt" w:eastAsia="Prompt" w:hAnsi="Prompt"/>
+                <w:b/>
+                <w:bCs/>
+                <w:color w:val="FFFFFF"/>
+                <w:sz w:val="18"/>
+                <w:szCs w:val="18"/>
+              </w:rPr>
+              <w:t xml:space="preserve">หัวข้อ</w:t>
+            </w:r>
+          </w:p>
+        </w:tc>
+        <w:tc>
+          <w:tcPr>
+            <w:tcW w:type="dxa" w:w="7160"/>
+            <w:tcBorders>
+              <w:top w:val="single" w:color="1F3864" w:sz="1"/>
+              <w:left w:val="single" w:color="1F3864" w:sz="1"/>
+              <w:bottom w:val="single" w:color="1F3864" w:sz="1"/>
+              <w:right w:val="single" w:color="1F3864" w:sz="1"/>
+            </w:tcBorders>
+            <w:shd w:fill="1F3864" w:color="auto" w:val="clear"/>
+            <w:tcMar>
+              <w:top w:type="dxa" w:w="60"/>
+              <w:left w:type="dxa" w:w="110"/>
+              <w:bottom w:type="dxa" w:w="60"/>
+              <w:right w:type="dxa" w:w="110"/>
+            </w:tcMar>
+            <w:vAlign w:val="center"/>
+          </w:tcPr>
+          <w:p>
+            <w:pPr>
+              <w:spacing w:line="252"/>
+            </w:pPr>
+            <w:r>
+              <w:rPr>
+                <w:rFonts w:ascii="Prompt" w:cs="Prompt" w:eastAsia="Prompt" w:hAnsi="Prompt"/>
+                <w:b/>
+                <w:bCs/>
+                <w:color w:val="FFFFFF"/>
+                <w:sz w:val="18"/>
+                <w:szCs w:val="18"/>
+              </w:rPr>
+              <w:t xml:space="preserve">รายละเอียด</w:t>
+            </w:r>
+          </w:p>
+        </w:tc>
+      </w:tr>
+      <w:tr>
+        <w:tc>
+          <w:tcPr>
+            <w:tcW w:type="dxa" w:w="2200"/>
+            <w:tcBorders>
+              <w:top w:val="single" w:color="C9D3E0" w:sz="1"/>
+              <w:left w:val="single" w:color="C9D3E0" w:sz="1"/>
+              <w:bottom w:val="single" w:color="C9D3E0" w:sz="1"/>
+              <w:right w:val="single" w:color="C9D3E0" w:sz="1"/>
+            </w:tcBorders>
+            <w:shd w:fill="FFFFFF" w:color="auto" w:val="clear"/>
+            <w:tcMar>
+              <w:top w:type="dxa" w:w="60"/>
+              <w:left w:type="dxa" w:w="110"/>
+              <w:bottom w:type="dxa" w:w="60"/>
+              <w:right w:type="dxa" w:w="110"/>
+            </w:tcMar>
+            <w:vAlign w:val="center"/>
+          </w:tcPr>
+          <w:p>
+            <w:pPr>
+              <w:spacing w:line="252"/>
+            </w:pPr>
+            <w:r>
+              <w:rPr>
+                <w:rFonts w:ascii="Prompt" w:cs="Prompt" w:eastAsia="Prompt" w:hAnsi="Prompt"/>
+                <w:color w:val="1A1A1A"/>
+                <w:sz w:val="17"/>
+                <w:szCs w:val="17"/>
+              </w:rPr>
+              <w:t xml:space="preserve">Database</w:t>
+            </w:r>
+          </w:p>
+        </w:tc>
+        <w:tc>
+          <w:tcPr>
+            <w:tcW w:type="dxa" w:w="7160"/>
+            <w:tcBorders>
+              <w:top w:val="single" w:color="C9D3E0" w:sz="1"/>
+              <w:left w:val="single" w:color="C9D3E0" w:sz="1"/>
+              <w:bottom w:val="single" w:color="C9D3E0" w:sz="1"/>
+              <w:right w:val="single" w:color="C9D3E0" w:sz="1"/>
+            </w:tcBorders>
+            <w:shd w:fill="FFFFFF" w:color="auto" w:val="clear"/>
+            <w:tcMar>
+              <w:top w:type="dxa" w:w="60"/>
+              <w:left w:type="dxa" w:w="110"/>
+              <w:bottom w:type="dxa" w:w="60"/>
+              <w:right w:type="dxa" w:w="110"/>
+            </w:tcMar>
+            <w:vAlign w:val="center"/>
+          </w:tcPr>
+          <w:p>
+            <w:pPr>
+              <w:spacing w:line="252"/>
+            </w:pPr>
+            <w:r>
+              <w:rPr>
+                <w:rFonts w:ascii="Prompt" w:cs="Prompt" w:eastAsia="Prompt" w:hAnsi="Prompt"/>
+                <w:color w:val="1A1A1A"/>
+                <w:sz w:val="17"/>
+                <w:szCs w:val="17"/>
+              </w:rPr>
+              <w:t xml:space="preserve">db_truckscale · MySQL (Railway cloud) · 403,908 ใบชั่ง (ยืนยัน live)</w:t>
+            </w:r>
+          </w:p>
+        </w:tc>
+      </w:tr>
+      <w:tr>
+        <w:tc>
+          <w:tcPr>
+            <w:tcW w:type="dxa" w:w="2200"/>
+            <w:tcBorders>
+              <w:top w:val="single" w:color="C9D3E0" w:sz="1"/>
+              <w:left w:val="single" w:color="C9D3E0" w:sz="1"/>
+              <w:bottom w:val="single" w:color="C9D3E0" w:sz="1"/>
+              <w:right w:val="single" w:color="C9D3E0" w:sz="1"/>
+            </w:tcBorders>
+            <w:shd w:fill="FFFFFF" w:color="auto" w:val="clear"/>
+            <w:tcMar>
+              <w:top w:type="dxa" w:w="60"/>
+              <w:left w:type="dxa" w:w="110"/>
+              <w:bottom w:type="dxa" w:w="60"/>
+              <w:right w:type="dxa" w:w="110"/>
+            </w:tcMar>
+            <w:vAlign w:val="center"/>
+          </w:tcPr>
+          <w:p>
+            <w:pPr>
+              <w:spacing w:line="252"/>
+            </w:pPr>
+            <w:r>
+              <w:rPr>
+                <w:rFonts w:ascii="Prompt" w:cs="Prompt" w:eastAsia="Prompt" w:hAnsi="Prompt"/>
+                <w:color w:val="1A1A1A"/>
+                <w:sz w:val="17"/>
+                <w:szCs w:val="17"/>
+              </w:rPr>
+              <w:t xml:space="preserve">Driver</w:t>
+            </w:r>
+          </w:p>
+        </w:tc>
+        <w:tc>
+          <w:tcPr>
+            <w:tcW w:type="dxa" w:w="7160"/>
+            <w:tcBorders>
+              <w:top w:val="single" w:color="C9D3E0" w:sz="1"/>
+              <w:left w:val="single" w:color="C9D3E0" w:sz="1"/>
+              <w:bottom w:val="single" w:color="C9D3E0" w:sz="1"/>
+              <w:right w:val="single" w:color="C9D3E0" w:sz="1"/>
+            </w:tcBorders>
+            <w:shd w:fill="FFFFFF" w:color="auto" w:val="clear"/>
+            <w:tcMar>
+              <w:top w:type="dxa" w:w="60"/>
+              <w:left w:type="dxa" w:w="110"/>
+              <w:bottom w:type="dxa" w:w="60"/>
+              <w:right w:type="dxa" w:w="110"/>
+            </w:tcMar>
+            <w:vAlign w:val="center"/>
+          </w:tcPr>
+          <w:p>
+            <w:pPr>
+              <w:spacing w:line="252"/>
+            </w:pPr>
+            <w:r>
+              <w:rPr>
+                <w:rFonts w:ascii="Prompt" w:cs="Prompt" w:eastAsia="Prompt" w:hAnsi="Prompt"/>
+                <w:color w:val="1A1A1A"/>
+                <w:sz w:val="17"/>
+                <w:szCs w:val="17"/>
+              </w:rPr>
+              <w:t xml:space="preserve">mysql2/promise — pool แยก (services/truckscale-db.js) ไม่เกี่ยวกับ DB_MODE</w:t>
+            </w:r>
+          </w:p>
+        </w:tc>
+      </w:tr>
+      <w:tr>
+        <w:tc>
+          <w:tcPr>
+            <w:tcW w:type="dxa" w:w="2200"/>
+            <w:tcBorders>
+              <w:top w:val="single" w:color="C9D3E0" w:sz="1"/>
+              <w:left w:val="single" w:color="C9D3E0" w:sz="1"/>
+              <w:bottom w:val="single" w:color="C9D3E0" w:sz="1"/>
+              <w:right w:val="single" w:color="C9D3E0" w:sz="1"/>
+            </w:tcBorders>
+            <w:shd w:fill="FFFFFF" w:color="auto" w:val="clear"/>
+            <w:tcMar>
+              <w:top w:type="dxa" w:w="60"/>
+              <w:left w:type="dxa" w:w="110"/>
+              <w:bottom w:type="dxa" w:w="60"/>
+              <w:right w:type="dxa" w:w="110"/>
+            </w:tcMar>
+            <w:vAlign w:val="center"/>
+          </w:tcPr>
+          <w:p>
+            <w:pPr>
+              <w:spacing w:line="252"/>
+            </w:pPr>
+            <w:r>
+              <w:rPr>
+                <w:rFonts w:ascii="Prompt" w:cs="Prompt" w:eastAsia="Prompt" w:hAnsi="Prompt"/>
+                <w:color w:val="1A1A1A"/>
+                <w:sz w:val="17"/>
+                <w:szCs w:val="17"/>
+              </w:rPr>
+              <w:t xml:space="preserve">Env</w:t>
+            </w:r>
+          </w:p>
+        </w:tc>
+        <w:tc>
+          <w:tcPr>
+            <w:tcW w:type="dxa" w:w="7160"/>
+            <w:tcBorders>
+              <w:top w:val="single" w:color="C9D3E0" w:sz="1"/>
+              <w:left w:val="single" w:color="C9D3E0" w:sz="1"/>
+              <w:bottom w:val="single" w:color="C9D3E0" w:sz="1"/>
+              <w:right w:val="single" w:color="C9D3E0" w:sz="1"/>
+            </w:tcBorders>
+            <w:shd w:fill="FFFFFF" w:color="auto" w:val="clear"/>
+            <w:tcMar>
+              <w:top w:type="dxa" w:w="60"/>
+              <w:left w:type="dxa" w:w="110"/>
+              <w:bottom w:type="dxa" w:w="60"/>
+              <w:right w:type="dxa" w:w="110"/>
+            </w:tcMar>
+            <w:vAlign w:val="center"/>
+          </w:tcPr>
+          <w:p>
+            <w:pPr>
+              <w:spacing w:line="252"/>
+            </w:pPr>
+            <w:r>
+              <w:rPr>
+                <w:rFonts w:ascii="Prompt" w:cs="Prompt" w:eastAsia="Prompt" w:hAnsi="Prompt"/>
+                <w:color w:val="1A1A1A"/>
+                <w:sz w:val="17"/>
+                <w:szCs w:val="17"/>
+              </w:rPr>
+              <w:t xml:space="preserve">MYSQL_HOST/PORT/DATABASE/USER/PASSWORD · ⚠ ห้ามตั้ง DB_MODE=mysql (DB_MODE คุม SQL Server)</w:t>
+            </w:r>
+          </w:p>
+        </w:tc>
+      </w:tr>
+      <w:tr>
+        <w:tc>
+          <w:tcPr>
+            <w:tcW w:type="dxa" w:w="2200"/>
+            <w:tcBorders>
+              <w:top w:val="single" w:color="C9D3E0" w:sz="1"/>
+              <w:left w:val="single" w:color="C9D3E0" w:sz="1"/>
+              <w:bottom w:val="single" w:color="C9D3E0" w:sz="1"/>
+              <w:right w:val="single" w:color="C9D3E0" w:sz="1"/>
+            </w:tcBorders>
+            <w:shd w:fill="FFFFFF" w:color="auto" w:val="clear"/>
+            <w:tcMar>
+              <w:top w:type="dxa" w:w="60"/>
+              <w:left w:type="dxa" w:w="110"/>
+              <w:bottom w:type="dxa" w:w="60"/>
+              <w:right w:type="dxa" w:w="110"/>
+            </w:tcMar>
+            <w:vAlign w:val="center"/>
+          </w:tcPr>
+          <w:p>
+            <w:pPr>
+              <w:spacing w:line="252"/>
+            </w:pPr>
+            <w:r>
+              <w:rPr>
+                <w:rFonts w:ascii="Prompt" w:cs="Prompt" w:eastAsia="Prompt" w:hAnsi="Prompt"/>
+                <w:color w:val="1A1A1A"/>
+                <w:sz w:val="17"/>
+                <w:szCs w:val="17"/>
+              </w:rPr>
+              <w:t xml:space="preserve">Production</w:t>
+            </w:r>
+          </w:p>
+        </w:tc>
+        <w:tc>
+          <w:tcPr>
+            <w:tcW w:type="dxa" w:w="7160"/>
+            <w:tcBorders>
+              <w:top w:val="single" w:color="C9D3E0" w:sz="1"/>
+              <w:left w:val="single" w:color="C9D3E0" w:sz="1"/>
+              <w:bottom w:val="single" w:color="C9D3E0" w:sz="1"/>
+              <w:right w:val="single" w:color="C9D3E0" w:sz="1"/>
+            </w:tcBorders>
+            <w:shd w:fill="FFFFFF" w:color="auto" w:val="clear"/>
+            <w:tcMar>
+              <w:top w:type="dxa" w:w="60"/>
+              <w:left w:type="dxa" w:w="110"/>
+              <w:bottom w:type="dxa" w:w="60"/>
+              <w:right w:type="dxa" w:w="110"/>
+            </w:tcMar>
+            <w:vAlign w:val="center"/>
+          </w:tcPr>
+          <w:p>
+            <w:pPr>
+              <w:spacing w:line="252"/>
+            </w:pPr>
+            <w:r>
+              <w:rPr>
+                <w:rFonts w:ascii="Prompt" w:cs="Prompt" w:eastAsia="Prompt" w:hAnsi="Prompt"/>
+                <w:color w:val="1A1A1A"/>
+                <w:sz w:val="17"/>
+                <w:szCs w:val="17"/>
+              </w:rPr>
+              <w:t xml:space="preserve">ต้องเพิ่ม MYSQL_* ใน env ของ Railway backend ด้วย (local .env = dev)</w:t>
+            </w:r>
+          </w:p>
+        </w:tc>
+      </w:tr>
+    </w:tbl>
+    <w:p/>
+    <w:p>
+      <w:pPr>
+        <w:pStyle w:val="Heading2"/>
+        <w:spacing w:after="120" w:before="240"/>
+      </w:pPr>
+      <w:r>
+        <w:rPr>
+          <w:rFonts w:ascii="Prompt" w:cs="Prompt" w:eastAsia="Prompt" w:hAnsi="Prompt"/>
+          <w:b/>
+          <w:bCs/>
+          <w:color w:val="1F3864"/>
+          <w:sz w:val="24"/>
+          <w:szCs w:val="24"/>
+        </w:rPr>
+        <w:t xml:space="preserve">18.2 Endpoint</w:t>
+      </w:r>
+    </w:p>
+    <w:tbl>
+      <w:tblPr>
+        <w:tblW w:type="dxa" w:w="9360"/>
+        <w:tblBorders>
+          <w:top w:val="single" w:color="auto" w:sz="4"/>
+          <w:left w:val="single" w:color="auto" w:sz="4"/>
+          <w:bottom w:val="single" w:color="auto" w:sz="4"/>
+          <w:right w:val="single" w:color="auto" w:sz="4"/>
+          <w:insideH w:val="single" w:color="auto" w:sz="4"/>
+          <w:insideV w:val="single" w:color="auto" w:sz="4"/>
+        </w:tblBorders>
+      </w:tblPr>
+      <w:tblGrid>
+        <w:gridCol w:w="4360"/>
+        <w:gridCol w:w="5000"/>
+      </w:tblGrid>
+      <w:tr>
+        <w:trPr>
+          <w:tblHeader/>
+        </w:trPr>
+        <w:tc>
+          <w:tcPr>
+            <w:tcW w:type="dxa" w:w="4360"/>
+            <w:tcBorders>
+              <w:top w:val="single" w:color="1F3864" w:sz="1"/>
+              <w:left w:val="single" w:color="1F3864" w:sz="1"/>
+              <w:bottom w:val="single" w:color="1F3864" w:sz="1"/>
+              <w:right w:val="single" w:color="1F3864" w:sz="1"/>
+            </w:tcBorders>
+            <w:shd w:fill="1F3864" w:color="auto" w:val="clear"/>
+            <w:tcMar>
+              <w:top w:type="dxa" w:w="60"/>
+              <w:left w:type="dxa" w:w="110"/>
+              <w:bottom w:type="dxa" w:w="60"/>
+              <w:right w:type="dxa" w:w="110"/>
+            </w:tcMar>
+            <w:vAlign w:val="center"/>
+          </w:tcPr>
+          <w:p>
+            <w:pPr>
+              <w:spacing w:line="252"/>
+            </w:pPr>
+            <w:r>
+              <w:rPr>
+                <w:rFonts w:ascii="Prompt" w:cs="Prompt" w:eastAsia="Prompt" w:hAnsi="Prompt"/>
+                <w:b/>
+                <w:bCs/>
+                <w:color w:val="FFFFFF"/>
+                <w:sz w:val="18"/>
+                <w:szCs w:val="18"/>
+              </w:rPr>
+              <w:t xml:space="preserve">Endpoint</w:t>
+            </w:r>
+          </w:p>
+        </w:tc>
+        <w:tc>
+          <w:tcPr>
+            <w:tcW w:type="dxa" w:w="5000"/>
+            <w:tcBorders>
+              <w:top w:val="single" w:color="1F3864" w:sz="1"/>
+              <w:left w:val="single" w:color="1F3864" w:sz="1"/>
+              <w:bottom w:val="single" w:color="1F3864" w:sz="1"/>
+              <w:right w:val="single" w:color="1F3864" w:sz="1"/>
+            </w:tcBorders>
+            <w:shd w:fill="1F3864" w:color="auto" w:val="clear"/>
+            <w:tcMar>
+              <w:top w:type="dxa" w:w="60"/>
+              <w:left w:type="dxa" w:w="110"/>
+              <w:bottom w:type="dxa" w:w="60"/>
+              <w:right w:type="dxa" w:w="110"/>
+            </w:tcMar>
+            <w:vAlign w:val="center"/>
+          </w:tcPr>
+          <w:p>
+            <w:pPr>
+              <w:spacing w:line="252"/>
+            </w:pPr>
+            <w:r>
+              <w:rPr>
+                <w:rFonts w:ascii="Prompt" w:cs="Prompt" w:eastAsia="Prompt" w:hAnsi="Prompt"/>
+                <w:b/>
+                <w:bCs/>
+                <w:color w:val="FFFFFF"/>
+                <w:sz w:val="18"/>
+                <w:szCs w:val="18"/>
+              </w:rPr>
+              <w:t xml:space="preserve">สาระ</w:t>
+            </w:r>
+          </w:p>
+        </w:tc>
+      </w:tr>
+      <w:tr>
+        <w:tc>
+          <w:tcPr>
+            <w:tcW w:type="dxa" w:w="4360"/>
+            <w:tcBorders>
+              <w:top w:val="single" w:color="C9D3E0" w:sz="1"/>
+              <w:left w:val="single" w:color="C9D3E0" w:sz="1"/>
+              <w:bottom w:val="single" w:color="C9D3E0" w:sz="1"/>
+              <w:right w:val="single" w:color="C9D3E0" w:sz="1"/>
+            </w:tcBorders>
+            <w:shd w:fill="FFFFFF" w:color="auto" w:val="clear"/>
+            <w:tcMar>
+              <w:top w:type="dxa" w:w="60"/>
+              <w:left w:type="dxa" w:w="110"/>
+              <w:bottom w:type="dxa" w:w="60"/>
+              <w:right w:type="dxa" w:w="110"/>
+            </w:tcMar>
+            <w:vAlign w:val="center"/>
+          </w:tcPr>
+          <w:p>
+            <w:pPr>
+              <w:spacing w:line="252"/>
+            </w:pPr>
+            <w:r>
+              <w:rPr>
+                <w:rFonts w:ascii="Prompt" w:cs="Prompt" w:eastAsia="Prompt" w:hAnsi="Prompt"/>
+                <w:color w:val="1A1A1A"/>
+                <w:sz w:val="17"/>
+                <w:szCs w:val="17"/>
+              </w:rPr>
+              <w:t xml:space="preserve">GET /api/truckscale/ping</w:t>
+            </w:r>
+          </w:p>
+        </w:tc>
+        <w:tc>
+          <w:tcPr>
+            <w:tcW w:type="dxa" w:w="5000"/>
+            <w:tcBorders>
+              <w:top w:val="single" w:color="C9D3E0" w:sz="1"/>
+              <w:left w:val="single" w:color="C9D3E0" w:sz="1"/>
+              <w:bottom w:val="single" w:color="C9D3E0" w:sz="1"/>
+              <w:right w:val="single" w:color="C9D3E0" w:sz="1"/>
+            </w:tcBorders>
+            <w:shd w:fill="FFFFFF" w:color="auto" w:val="clear"/>
+            <w:tcMar>
+              <w:top w:type="dxa" w:w="60"/>
+              <w:left w:type="dxa" w:w="110"/>
+              <w:bottom w:type="dxa" w:w="60"/>
+              <w:right w:type="dxa" w:w="110"/>
+            </w:tcMar>
+            <w:vAlign w:val="center"/>
+          </w:tcPr>
+          <w:p>
+            <w:pPr>
+              <w:spacing w:line="252"/>
+            </w:pPr>
+            <w:r>
+              <w:rPr>
+                <w:rFonts w:ascii="Prompt" w:cs="Prompt" w:eastAsia="Prompt" w:hAnsi="Prompt"/>
+                <w:color w:val="1A1A1A"/>
+                <w:sz w:val="17"/>
+                <w:szCs w:val="17"/>
+              </w:rPr>
+              <w:t xml:space="preserve">สถานะการเชื่อมต่อ + จำนวนใบชั่ง</w:t>
+            </w:r>
+          </w:p>
+        </w:tc>
+      </w:tr>
+      <w:tr>
+        <w:tc>
+          <w:tcPr>
+            <w:tcW w:type="dxa" w:w="4360"/>
+            <w:tcBorders>
+              <w:top w:val="single" w:color="C9D3E0" w:sz="1"/>
+              <w:left w:val="single" w:color="C9D3E0" w:sz="1"/>
+              <w:bottom w:val="single" w:color="C9D3E0" w:sz="1"/>
+              <w:right w:val="single" w:color="C9D3E0" w:sz="1"/>
+            </w:tcBorders>
+            <w:shd w:fill="FFFFFF" w:color="auto" w:val="clear"/>
+            <w:tcMar>
+              <w:top w:type="dxa" w:w="60"/>
+              <w:left w:type="dxa" w:w="110"/>
+              <w:bottom w:type="dxa" w:w="60"/>
+              <w:right w:type="dxa" w:w="110"/>
+            </w:tcMar>
+            <w:vAlign w:val="center"/>
+          </w:tcPr>
+          <w:p>
+            <w:pPr>
+              <w:spacing w:line="252"/>
+            </w:pPr>
+            <w:r>
+              <w:rPr>
+                <w:rFonts w:ascii="Prompt" w:cs="Prompt" w:eastAsia="Prompt" w:hAnsi="Prompt"/>
+                <w:color w:val="1A1A1A"/>
+                <w:sz w:val="17"/>
+                <w:szCs w:val="17"/>
+              </w:rPr>
+              <w:t xml:space="preserve">GET /api/truckscale/weigh?plate= | movebill=</w:t>
+            </w:r>
+          </w:p>
+        </w:tc>
+        <w:tc>
+          <w:tcPr>
+            <w:tcW w:type="dxa" w:w="5000"/>
+            <w:tcBorders>
+              <w:top w:val="single" w:color="C9D3E0" w:sz="1"/>
+              <w:left w:val="single" w:color="C9D3E0" w:sz="1"/>
+              <w:bottom w:val="single" w:color="C9D3E0" w:sz="1"/>
+              <w:right w:val="single" w:color="C9D3E0" w:sz="1"/>
+            </w:tcBorders>
+            <w:shd w:fill="FFFFFF" w:color="auto" w:val="clear"/>
+            <w:tcMar>
+              <w:top w:type="dxa" w:w="60"/>
+              <w:left w:type="dxa" w:w="110"/>
+              <w:bottom w:type="dxa" w:w="60"/>
+              <w:right w:type="dxa" w:w="110"/>
+            </w:tcMar>
+            <w:vAlign w:val="center"/>
+          </w:tcPr>
+          <w:p>
+            <w:pPr>
+              <w:spacing w:line="252"/>
+            </w:pPr>
+            <w:r>
+              <w:rPr>
+                <w:rFonts w:ascii="Prompt" w:cs="Prompt" w:eastAsia="Prompt" w:hAnsi="Prompt"/>
+                <w:color w:val="1A1A1A"/>
+                <w:sz w:val="17"/>
+                <w:szCs w:val="17"/>
+              </w:rPr>
+              <w:t xml:space="preserve">ค้นรายการชั่ง (in/out/net kg)</w:t>
+            </w:r>
+          </w:p>
+        </w:tc>
+      </w:tr>
+      <w:tr>
+        <w:tc>
+          <w:tcPr>
+            <w:tcW w:type="dxa" w:w="4360"/>
+            <w:tcBorders>
+              <w:top w:val="single" w:color="C9D3E0" w:sz="1"/>
+              <w:left w:val="single" w:color="C9D3E0" w:sz="1"/>
+              <w:bottom w:val="single" w:color="C9D3E0" w:sz="1"/>
+              <w:right w:val="single" w:color="C9D3E0" w:sz="1"/>
+            </w:tcBorders>
+            <w:shd w:fill="FFFFFF" w:color="auto" w:val="clear"/>
+            <w:tcMar>
+              <w:top w:type="dxa" w:w="60"/>
+              <w:left w:type="dxa" w:w="110"/>
+              <w:bottom w:type="dxa" w:w="60"/>
+              <w:right w:type="dxa" w:w="110"/>
+            </w:tcMar>
+            <w:vAlign w:val="center"/>
+          </w:tcPr>
+          <w:p>
+            <w:pPr>
+              <w:spacing w:line="252"/>
+            </w:pPr>
+            <w:r>
+              <w:rPr>
+                <w:rFonts w:ascii="Prompt" w:cs="Prompt" w:eastAsia="Prompt" w:hAnsi="Prompt"/>
+                <w:color w:val="1A1A1A"/>
+                <w:sz w:val="17"/>
+                <w:szCs w:val="17"/>
+              </w:rPr>
+              <w:t xml:space="preserve">GET /api/truckscale/scale/:sequence</w:t>
+            </w:r>
+          </w:p>
+        </w:tc>
+        <w:tc>
+          <w:tcPr>
+            <w:tcW w:type="dxa" w:w="5000"/>
+            <w:tcBorders>
+              <w:top w:val="single" w:color="C9D3E0" w:sz="1"/>
+              <w:left w:val="single" w:color="C9D3E0" w:sz="1"/>
+              <w:bottom w:val="single" w:color="C9D3E0" w:sz="1"/>
+              <w:right w:val="single" w:color="C9D3E0" w:sz="1"/>
+            </w:tcBorders>
+            <w:shd w:fill="FFFFFF" w:color="auto" w:val="clear"/>
+            <w:tcMar>
+              <w:top w:type="dxa" w:w="60"/>
+              <w:left w:type="dxa" w:w="110"/>
+              <w:bottom w:type="dxa" w:w="60"/>
+              <w:right w:type="dxa" w:w="110"/>
+            </w:tcMar>
+            <w:vAlign w:val="center"/>
+          </w:tcPr>
+          <w:p>
+            <w:pPr>
+              <w:spacing w:line="252"/>
+            </w:pPr>
+            <w:r>
+              <w:rPr>
+                <w:rFonts w:ascii="Prompt" w:cs="Prompt" w:eastAsia="Prompt" w:hAnsi="Prompt"/>
+                <w:color w:val="1A1A1A"/>
+                <w:sz w:val="17"/>
+                <w:szCs w:val="17"/>
+              </w:rPr>
+              <w:t xml:space="preserve">รายละเอียดใบชั่ง + สินค้า (join one_num)</w:t>
+            </w:r>
+          </w:p>
+        </w:tc>
+      </w:tr>
+      <w:tr>
+        <w:tc>
+          <w:tcPr>
+            <w:tcW w:type="dxa" w:w="4360"/>
+            <w:tcBorders>
+              <w:top w:val="single" w:color="C9D3E0" w:sz="1"/>
+              <w:left w:val="single" w:color="C9D3E0" w:sz="1"/>
+              <w:bottom w:val="single" w:color="C9D3E0" w:sz="1"/>
+              <w:right w:val="single" w:color="C9D3E0" w:sz="1"/>
+            </w:tcBorders>
+            <w:shd w:fill="FFFFFF" w:color="auto" w:val="clear"/>
+            <w:tcMar>
+              <w:top w:type="dxa" w:w="60"/>
+              <w:left w:type="dxa" w:w="110"/>
+              <w:bottom w:type="dxa" w:w="60"/>
+              <w:right w:type="dxa" w:w="110"/>
+            </w:tcMar>
+            <w:vAlign w:val="center"/>
+          </w:tcPr>
+          <w:p>
+            <w:pPr>
+              <w:spacing w:line="252"/>
+            </w:pPr>
+            <w:r>
+              <w:rPr>
+                <w:rFonts w:ascii="Prompt" w:cs="Prompt" w:eastAsia="Prompt" w:hAnsi="Prompt"/>
+                <w:color w:val="1A1A1A"/>
+                <w:sz w:val="17"/>
+                <w:szCs w:val="17"/>
+              </w:rPr>
+              <w:t xml:space="preserve">GET /api/truckscale/for-so/:soId</w:t>
+            </w:r>
+          </w:p>
+        </w:tc>
+        <w:tc>
+          <w:tcPr>
+            <w:tcW w:type="dxa" w:w="5000"/>
+            <w:tcBorders>
+              <w:top w:val="single" w:color="C9D3E0" w:sz="1"/>
+              <w:left w:val="single" w:color="C9D3E0" w:sz="1"/>
+              <w:bottom w:val="single" w:color="C9D3E0" w:sz="1"/>
+              <w:right w:val="single" w:color="C9D3E0" w:sz="1"/>
+            </w:tcBorders>
+            <w:shd w:fill="FFFFFF" w:color="auto" w:val="clear"/>
+            <w:tcMar>
+              <w:top w:type="dxa" w:w="60"/>
+              <w:left w:type="dxa" w:w="110"/>
+              <w:bottom w:type="dxa" w:w="60"/>
+              <w:right w:type="dxa" w:w="110"/>
+            </w:tcMar>
+            <w:vAlign w:val="center"/>
+          </w:tcPr>
+          <w:p>
+            <w:pPr>
+              <w:spacing w:line="252"/>
+            </w:pPr>
+            <w:r>
+              <w:rPr>
+                <w:rFonts w:ascii="Prompt" w:cs="Prompt" w:eastAsia="Prompt" w:hAnsi="Prompt"/>
+                <w:color w:val="1A1A1A"/>
+                <w:sz w:val="17"/>
+                <w:szCs w:val="17"/>
+              </w:rPr>
+              <w:t xml:space="preserve">หาน้ำหนักชั่งที่ match SO (ด้วยทะเบียนรถ)</w:t>
+            </w:r>
+          </w:p>
+        </w:tc>
+      </w:tr>
+    </w:tbl>
+    <w:p/>
+    <w:p>
+      <w:pPr>
+        <w:pStyle w:val="Heading2"/>
+        <w:spacing w:after="120" w:before="240"/>
+      </w:pPr>
+      <w:r>
+        <w:rPr>
+          <w:rFonts w:ascii="Prompt" w:cs="Prompt" w:eastAsia="Prompt" w:hAnsi="Prompt"/>
+          <w:b/>
+          <w:bCs/>
+          <w:color w:val="1F3864"/>
+          <w:sz w:val="24"/>
+          <w:szCs w:val="24"/>
+        </w:rPr>
+        <w:t xml:space="preserve">18.3 การจับคู่ (Matching) — ข้อค้นพบจริง</w:t>
+      </w:r>
+    </w:p>
+    <w:p>
+      <w:pPr>
+        <w:spacing w:after="80" w:line="276"/>
+      </w:pPr>
+      <w:r>
+        <w:rPr>
+          <w:rFonts w:ascii="Prompt" w:cs="Prompt" w:eastAsia="Prompt" w:hAnsi="Prompt"/>
+          <w:b/>
+          <w:bCs/>
+          <w:color w:val="A32D2D"/>
+          <w:sz w:val="17"/>
+          <w:szCs w:val="17"/>
+        </w:rPr>
+        <w:t xml:space="preserve">ยืนยันจากข้อมูล live: คอลัมน์ pd_pro_invoid สกปรกมาก (เช่น "ขาย", "ไม่ระบุ", เลขบางส่วน) → ใช้จับคู่กับ WINSpeed DocuNo ไม่ได้ · จึงใช้ ทะเบียนรถ (one_car_regis ↔ SOHD.TransRegistration) เป็น key หลัก</w:t>
+      </w:r>
+    </w:p>
+    <w:p>
+      <w:pPr>
+        <w:pStyle w:val="Heading2"/>
+        <w:spacing w:after="120" w:before="240"/>
+      </w:pPr>
+      <w:r>
+        <w:rPr>
+          <w:rFonts w:ascii="Prompt" w:cs="Prompt" w:eastAsia="Prompt" w:hAnsi="Prompt"/>
+          <w:b/>
+          <w:bCs/>
+          <w:color w:val="1F3864"/>
+          <w:sz w:val="24"/>
+          <w:szCs w:val="24"/>
+        </w:rPr>
+        <w:t xml:space="preserve">18.4 Flow ผ่าน App (Implemented)</w:t>
+      </w:r>
+    </w:p>
+    <w:p>
+      <w:pPr>
+        <w:spacing w:after="80" w:line="276"/>
+      </w:pPr>
+      <w:r>
+        <w:rPr>
+          <w:rFonts w:ascii="Prompt" w:cs="Prompt" w:eastAsia="Prompt" w:hAnsi="Prompt"/>
+          <w:color w:val="1A1A1A"/>
+          <w:sz w:val="18"/>
+          <w:szCs w:val="18"/>
+        </w:rPr>
+        <w:t xml:space="preserve">คลัง/ชั่งออก (PickingQueue) → กด “ดึงน้ำหนักจาก TruckScale” → ระบบหาใบชั่งจากทะเบียนรถของ SO → เลือกใบชั่ง → auto-fill ชั่งเข้า(tare)/ชั่งออก(gross)/เครื่องชั่ง/movebill → ยืนยัน Shipped → บันทึก wf.WeighTicket (gross/tare/net) + อ้าง Movebill</w:t>
+      </w:r>
+    </w:p>
+    <w:p>
+      <w:pPr>
+        <w:spacing w:after="80" w:line="276"/>
+      </w:pPr>
+      <w:r>
+        <w:rPr>
+          <w:rFonts w:ascii="Prompt" w:cs="Prompt" w:eastAsia="Prompt" w:hAnsi="Prompt"/>
+          <w:color w:val="6B6B6B"/>
+          <w:sz w:val="16"/>
+          <w:szCs w:val="16"/>
+        </w:rPr>
+        <w:t xml:space="preserve">— จบหมวด 18: TruckScale Live —</w:t>
+      </w:r>
+    </w:p>
+    <w:p>
       <w:pPr>
         <w:spacing w:before="160"/>
         <w:jc w:val="center"/>
@@ -52453,7 +53467,7 @@
           <w:sz w:val="16"/>
           <w:szCs w:val="16"/>
         </w:rPr>
-        <w:t xml:space="preserve">Software Requirements Specification | World Fert Co., Ltd. | v6.1 (Production — Implemented) | 27 มิ.ย. 2569</w:t>
+        <w:t xml:space="preserve">Software Requirements Specification | World Fert Co., Ltd. | v6.2 (Production — Implemented) | 27 มิ.ย. 2569</w:t>
       </w:r>
     </w:p>
     <w:sectPr>

</xml_diff>